<commit_message>
Fix: exp02 report personal info removal was not persisted, reapply and verify on disk
</commit_message>
<xml_diff>
--- a/reports/exp02_图像的缩放、加减乘除及平移旋转_实验报告.docx
+++ b/reports/exp02_图像的缩放、加减乘除及平移旋转_实验报告.docx
@@ -1,192 +1,20 @@
 
 <file path=word/document.xml><?xml version="1.0" encoding="utf-8"?>
-<w:document xmlns:wpc="http://schemas.microsoft.com/office/word/2010/wordprocessingCanvas" xmlns:cx="http://schemas.microsoft.com/office/drawing/2014/chartex" xmlns:cx1="http://schemas.microsoft.com/office/drawing/2015/9/8/chartex" xmlns:cx2="http://schemas.microsoft.com/office/drawing/2015/10/21/chartex" xmlns:cx3="http://schemas.microsoft.com/office/drawing/2016/5/9/chartex" xmlns:cx4="http://schemas.microsoft.com/office/drawing/2016/5/10/chartex" xmlns:cx5="http://schemas.microsoft.com/office/drawing/2016/5/11/chartex" xmlns:cx6="http://schemas.microsoft.com/office/drawing/2016/5/12/chartex" xmlns:cx7="http://schemas.microsoft.com/office/drawing/2016/5/13/chartex" xmlns:cx8="http://schemas.microsoft.com/office/drawing/2016/5/14/chartex" xmlns:mc="http://schemas.openxmlformats.org/markup-compatibility/2006" xmlns:o="urn:schemas-microsoft-com:office:office" xmlns:r="http://schemas.openxmlformats.org/officeDocument/2006/relationships" xmlns:m="http://schemas.openxmlformats.org/officeDocument/2006/math" xmlns:v="urn:schemas-microsoft-com:vml" xmlns:wp14="http://schemas.microsoft.com/office/word/2010/wordprocessingDrawing" xmlns:wp="http://schemas.openxmlformats.org/drawingml/2006/wordprocessingDrawing" xmlns:w="http://schemas.openxmlformats.org/wordprocessingml/2006/main" xmlns:w14="http://schemas.microsoft.com/office/word/2010/wordml" xmlns:w10="urn:schemas-microsoft-com:office:word" xmlns:w15="http://schemas.microsoft.com/office/word/2012/wordml" xmlns:wpg="http://schemas.microsoft.com/office/word/2010/wordprocessingGroup" xmlns:wpi="http://schemas.microsoft.com/office/word/2010/wordprocessingInk" xmlns:wne="http://schemas.microsoft.com/office/word/2006/wordml" xmlns:wps="http://schemas.microsoft.com/office/word/2010/wordprocessingShape" xmlns:wpsCustomData="http://www.wps.cn/officeDocument/2013/wpsCustomData" mc:Ignorable="w14 w15 wp14">
+<w:document xmlns:w="http://schemas.openxmlformats.org/wordprocessingml/2006/main" xmlns:a="http://schemas.openxmlformats.org/drawingml/2006/main" xmlns:wp="http://schemas.openxmlformats.org/drawingml/2006/wordprocessingDrawing" xmlns:pic="http://schemas.openxmlformats.org/drawingml/2006/picture" xmlns:r="http://schemas.openxmlformats.org/officeDocument/2006/relationships" xmlns:w14="http://schemas.microsoft.com/office/word/2010/wordml" xmlns:mc="http://schemas.openxmlformats.org/markup-compatibility/2006" mc:Ignorable="w14">
   <w:body>
-    <w:p>
-      <w:pPr>
-        <w:pStyle w:val="4"/>
-        <w:rPr>
-          <w:rFonts w:hint="eastAsia" w:ascii="宋体" w:hAnsi="宋体" w:eastAsia="宋体"/>
-          <w:lang w:val="en-US" w:eastAsia="zh-CN"/>
-        </w:rPr>
-      </w:pPr>
-      <w:bookmarkStart w:id="0" w:name="_Toc169118284"/>
-      <w:r>
-        <w:rPr>
-          <w:rFonts w:hint="eastAsia" w:ascii="宋体" w:hAnsi="宋体" w:eastAsia="宋体"/>
-        </w:rPr>
-        <w:t>江西师范大学人工智能学院学生实验报告</w:t>
-      </w:r>
-      <w:bookmarkEnd w:id="0"/>
-      <w:r>
-        <w:rPr>
-          <w:rFonts w:hint="eastAsia" w:ascii="宋体" w:hAnsi="宋体" w:eastAsia="宋体"/>
-          <w:lang w:val="en-US" w:eastAsia="zh-CN"/>
-        </w:rPr>
-        <w:t>二</w:t>
-      </w:r>
-    </w:p>
     <w:p>
       <w:pPr>
         <w:spacing w:before="312" w:beforeLines="100" w:after="156" w:afterLines="50"/>
         <w:rPr>
-          <w:b/>
-          <w:bCs/>
+          <w:b w:val="1"/>
+          <w:bCs w:val="1"/>
           <w:szCs w:val="21"/>
         </w:rPr>
       </w:pPr>
-      <w:r>
-        <w:rPr>
-          <w:rFonts w:hint="eastAsia" w:ascii="宋体" w:hAnsi="宋体"/>
-          <w:b/>
-          <w:bCs/>
-          <w:szCs w:val="21"/>
-        </w:rPr>
-        <w:t>专业</w:t>
-      </w:r>
-      <w:r>
-        <w:rPr>
-          <w:rFonts w:hint="eastAsia" w:ascii="宋体" w:hAnsi="宋体"/>
-          <w:b/>
-          <w:bCs/>
-          <w:szCs w:val="21"/>
-          <w:u w:val="single"/>
-        </w:rPr>
-        <w:t xml:space="preserve">  人工智能专业  </w:t>
-      </w:r>
-      <w:r>
-        <w:rPr>
-          <w:rFonts w:ascii="宋体" w:hAnsi="宋体"/>
-          <w:b/>
-          <w:bCs/>
-          <w:szCs w:val="21"/>
-          <w:u w:val="single"/>
-        </w:rPr>
-        <w:t xml:space="preserve"> </w:t>
-      </w:r>
-      <w:r>
-        <w:rPr>
-          <w:rFonts w:hint="eastAsia" w:ascii="宋体" w:hAnsi="宋体"/>
-          <w:b/>
-          <w:bCs/>
-          <w:szCs w:val="21"/>
-        </w:rPr>
-        <w:t xml:space="preserve">姓名 </w:t>
-      </w:r>
-      <w:r>
-        <w:rPr>
-          <w:rFonts w:hint="eastAsia" w:ascii="宋体" w:hAnsi="宋体"/>
-          <w:b/>
-          <w:bCs/>
-          <w:szCs w:val="21"/>
-          <w:u w:val="single"/>
-        </w:rPr>
-        <w:t xml:space="preserve">   </w:t>
-      </w:r>
-      <w:r>
-        <w:rPr>
-          <w:rFonts w:hint="eastAsia" w:ascii="宋体" w:hAnsi="宋体"/>
-          <w:b/>
-          <w:bCs/>
-          <w:szCs w:val="21"/>
-          <w:u w:val="single"/>
-          <w:lang w:val="en-US" w:eastAsia="zh-CN"/>
-        </w:rPr>
-        <w:t>王依倩</w:t>
-      </w:r>
-      <w:r>
-        <w:rPr>
-          <w:rFonts w:hint="eastAsia" w:ascii="宋体" w:hAnsi="宋体"/>
-          <w:b/>
-          <w:bCs/>
-          <w:szCs w:val="21"/>
-          <w:u w:val="single"/>
-        </w:rPr>
-        <w:t xml:space="preserve">   </w:t>
-      </w:r>
-      <w:r>
-        <w:rPr>
-          <w:rFonts w:hint="eastAsia" w:ascii="宋体" w:hAnsi="宋体"/>
-          <w:b/>
-          <w:bCs/>
-          <w:szCs w:val="21"/>
-        </w:rPr>
-        <w:t>学号</w:t>
-      </w:r>
-      <w:r>
-        <w:rPr>
-          <w:rFonts w:hint="eastAsia" w:ascii="宋体" w:hAnsi="宋体"/>
-          <w:b/>
-          <w:bCs/>
-          <w:szCs w:val="21"/>
-          <w:u w:val="single"/>
-        </w:rPr>
-        <w:t xml:space="preserve">  </w:t>
-      </w:r>
-      <w:r>
-        <w:rPr>
-          <w:rFonts w:hint="eastAsia" w:ascii="宋体" w:hAnsi="宋体"/>
-          <w:b/>
-          <w:bCs/>
-          <w:szCs w:val="21"/>
-          <w:u w:val="single"/>
-          <w:lang w:val="en-US" w:eastAsia="zh-CN"/>
-        </w:rPr>
-        <w:t>202426203004</w:t>
-      </w:r>
-      <w:r>
-        <w:rPr>
-          <w:rFonts w:hint="eastAsia" w:ascii="宋体" w:hAnsi="宋体"/>
-          <w:b/>
-          <w:bCs/>
-          <w:szCs w:val="21"/>
-          <w:u w:val="single"/>
-        </w:rPr>
-        <w:t xml:space="preserve">      </w:t>
-      </w:r>
-      <w:r>
-        <w:rPr>
-          <w:rFonts w:hint="eastAsia" w:ascii="宋体" w:hAnsi="宋体"/>
-          <w:b/>
-          <w:bCs/>
-          <w:szCs w:val="21"/>
-        </w:rPr>
-        <w:t>日期</w:t>
-      </w:r>
-      <w:r>
-        <w:rPr>
-          <w:rFonts w:ascii="宋体" w:hAnsi="宋体"/>
-          <w:b/>
-          <w:bCs/>
-          <w:szCs w:val="21"/>
-          <w:u w:val="single"/>
-        </w:rPr>
-        <w:t xml:space="preserve">   </w:t>
-      </w:r>
-      <w:r>
-        <w:rPr>
-          <w:rFonts w:hint="eastAsia" w:ascii="宋体" w:hAnsi="宋体"/>
-          <w:b/>
-          <w:bCs/>
-          <w:szCs w:val="21"/>
-          <w:u w:val="single"/>
-        </w:rPr>
-        <w:t>2026/9/7</w:t>
-      </w:r>
-      <w:r>
-        <w:rPr>
-          <w:rFonts w:ascii="宋体" w:hAnsi="宋体"/>
-          <w:b/>
-          <w:bCs/>
-          <w:szCs w:val="21"/>
-          <w:u w:val="single"/>
-        </w:rPr>
-        <w:t xml:space="preserve">    </w:t>
-      </w:r>
     </w:p>
     <w:tbl>
       <w:tblPr>
-        <w:tblStyle w:val="6"/>
+        <w:tblStyle w:val="00000c"/>
         <w:tblW w:w="0" w:type="auto"/>
         <w:jc w:val="center"/>
         <w:tblBorders>
@@ -212,140 +40,8 @@
         <w:gridCol w:w="2200"/>
       </w:tblGrid>
       <w:tr>
-        <w:tblPrEx>
-          <w:tblBorders>
-            <w:top w:val="single" w:color="auto" w:sz="4" w:space="0"/>
-            <w:left w:val="single" w:color="auto" w:sz="4" w:space="0"/>
-            <w:bottom w:val="single" w:color="auto" w:sz="4" w:space="0"/>
-            <w:right w:val="single" w:color="auto" w:sz="4" w:space="0"/>
-            <w:insideH w:val="single" w:color="auto" w:sz="4" w:space="0"/>
-            <w:insideV w:val="single" w:color="auto" w:sz="4" w:space="0"/>
-          </w:tblBorders>
-          <w:tblCellMar>
-            <w:top w:w="0" w:type="dxa"/>
-            <w:left w:w="108" w:type="dxa"/>
-            <w:bottom w:w="0" w:type="dxa"/>
-            <w:right w:w="108" w:type="dxa"/>
-          </w:tblCellMar>
-        </w:tblPrEx>
         <w:trPr>
-          <w:trHeight w:val="624" w:hRule="atLeast"/>
-          <w:jc w:val="center"/>
-        </w:trPr>
-        <w:tc>
-          <w:tcPr>
-            <w:tcW w:w="1595" w:type="dxa"/>
-            <w:vAlign w:val="center"/>
-          </w:tcPr>
-          <w:p>
-            <w:pPr>
-              <w:spacing w:line="320" w:lineRule="exact"/>
-              <w:jc w:val="center"/>
-              <w:rPr>
-                <w:rFonts w:ascii="宋体" w:hAnsi="华文中宋"/>
-                <w:sz w:val="24"/>
-              </w:rPr>
-            </w:pPr>
-            <w:r>
-              <w:rPr>
-                <w:rFonts w:hint="eastAsia" w:ascii="宋体" w:hAnsi="华文中宋"/>
-                <w:sz w:val="24"/>
-              </w:rPr>
-              <w:t>课程名称</w:t>
-            </w:r>
-          </w:p>
-        </w:tc>
-        <w:tc>
-          <w:tcPr>
-            <w:tcW w:w="3338" w:type="dxa"/>
-            <w:vAlign w:val="center"/>
-          </w:tcPr>
-          <w:p>
-            <w:pPr>
-              <w:spacing w:line="320" w:lineRule="exact"/>
-              <w:jc w:val="center"/>
-              <w:rPr>
-                <w:rFonts w:ascii="宋体" w:hAnsi="华文中宋"/>
-                <w:sz w:val="24"/>
-              </w:rPr>
-            </w:pPr>
-            <w:r>
-              <w:rPr>
-                <w:rFonts w:hint="eastAsia" w:ascii="宋体" w:hAnsi="华文中宋"/>
-                <w:sz w:val="24"/>
-              </w:rPr>
-              <w:t>计算机视觉基础</w:t>
-            </w:r>
-          </w:p>
-        </w:tc>
-        <w:tc>
-          <w:tcPr>
-            <w:tcW w:w="1655" w:type="dxa"/>
-            <w:vAlign w:val="center"/>
-          </w:tcPr>
-          <w:p>
-            <w:pPr>
-              <w:spacing w:line="320" w:lineRule="exact"/>
-              <w:jc w:val="center"/>
-              <w:rPr>
-                <w:rFonts w:ascii="宋体" w:hAnsi="华文中宋"/>
-                <w:sz w:val="24"/>
-              </w:rPr>
-            </w:pPr>
-            <w:r>
-              <w:rPr>
-                <w:rFonts w:hint="eastAsia" w:ascii="宋体" w:hAnsi="华文中宋"/>
-                <w:sz w:val="24"/>
-              </w:rPr>
-              <w:t>实验室名称</w:t>
-            </w:r>
-          </w:p>
-        </w:tc>
-        <w:tc>
-          <w:tcPr>
-            <w:tcW w:w="2200" w:type="dxa"/>
-            <w:vAlign w:val="center"/>
-          </w:tcPr>
-          <w:p>
-            <w:pPr>
-              <w:spacing w:line="320" w:lineRule="exact"/>
-              <w:jc w:val="center"/>
-              <w:rPr>
-                <w:rFonts w:hint="default" w:ascii="宋体" w:hAnsi="华文中宋" w:eastAsia="宋体"/>
-                <w:sz w:val="24"/>
-                <w:lang w:val="en-US" w:eastAsia="zh-CN"/>
-              </w:rPr>
-            </w:pPr>
-            <w:r>
-              <w:rPr>
-                <w:rFonts w:hint="eastAsia" w:ascii="宋体" w:hAnsi="华文中宋"/>
-                <w:sz w:val="24"/>
-                <w:lang w:val="en-US" w:eastAsia="zh-CN"/>
-              </w:rPr>
-              <w:t>X3323</w:t>
-            </w:r>
-          </w:p>
-        </w:tc>
-      </w:tr>
-      <w:tr>
-        <w:tblPrEx>
-          <w:tblBorders>
-            <w:top w:val="single" w:color="auto" w:sz="4" w:space="0"/>
-            <w:left w:val="single" w:color="auto" w:sz="4" w:space="0"/>
-            <w:bottom w:val="single" w:color="auto" w:sz="4" w:space="0"/>
-            <w:right w:val="single" w:color="auto" w:sz="4" w:space="0"/>
-            <w:insideH w:val="single" w:color="auto" w:sz="4" w:space="0"/>
-            <w:insideV w:val="single" w:color="auto" w:sz="4" w:space="0"/>
-          </w:tblBorders>
-          <w:tblCellMar>
-            <w:top w:w="0" w:type="dxa"/>
-            <w:left w:w="108" w:type="dxa"/>
-            <w:bottom w:w="0" w:type="dxa"/>
-            <w:right w:w="108" w:type="dxa"/>
-          </w:tblCellMar>
-        </w:tblPrEx>
-        <w:trPr>
-          <w:cantSplit/>
+          <w:cantSplit w:val="1"/>
           <w:trHeight w:val="634" w:hRule="atLeast"/>
           <w:jc w:val="center"/>
         </w:trPr>
@@ -384,7 +80,7 @@
             </w:pPr>
             <w:r>
               <w:rPr>
-                <w:rFonts w:ascii="宋体" w:hAnsi="宋体" w:eastAsia="宋体"/>
+                <w:rFonts w:hint="eastAsia" w:ascii="宋体" w:hAnsi="宋体" w:eastAsia="宋体"/>
                 <w:b w:val="0"/>
                 <w:sz w:val="24"/>
               </w:rPr>
@@ -394,132 +90,8 @@
         </w:tc>
       </w:tr>
       <w:tr>
-        <w:tblPrEx>
-          <w:tblBorders>
-            <w:top w:val="single" w:color="auto" w:sz="4" w:space="0"/>
-            <w:left w:val="single" w:color="auto" w:sz="4" w:space="0"/>
-            <w:bottom w:val="single" w:color="auto" w:sz="4" w:space="0"/>
-            <w:right w:val="single" w:color="auto" w:sz="4" w:space="0"/>
-            <w:insideH w:val="single" w:color="auto" w:sz="4" w:space="0"/>
-            <w:insideV w:val="single" w:color="auto" w:sz="4" w:space="0"/>
-          </w:tblBorders>
-          <w:tblCellMar>
-            <w:top w:w="0" w:type="dxa"/>
-            <w:left w:w="108" w:type="dxa"/>
-            <w:bottom w:w="0" w:type="dxa"/>
-            <w:right w:w="108" w:type="dxa"/>
-          </w:tblCellMar>
-        </w:tblPrEx>
         <w:trPr>
-          <w:trHeight w:val="621" w:hRule="atLeast"/>
-          <w:jc w:val="center"/>
-        </w:trPr>
-        <w:tc>
-          <w:tcPr>
-            <w:tcW w:w="1595" w:type="dxa"/>
-            <w:vAlign w:val="center"/>
-          </w:tcPr>
-          <w:p>
-            <w:pPr>
-              <w:spacing w:line="320" w:lineRule="exact"/>
-              <w:jc w:val="center"/>
-              <w:rPr>
-                <w:rFonts w:ascii="宋体" w:hAnsi="华文中宋"/>
-                <w:sz w:val="24"/>
-              </w:rPr>
-            </w:pPr>
-            <w:r>
-              <w:rPr>
-                <w:rFonts w:hint="eastAsia" w:ascii="宋体" w:hAnsi="华文中宋"/>
-                <w:sz w:val="24"/>
-              </w:rPr>
-              <w:t>指导教师</w:t>
-            </w:r>
-          </w:p>
-        </w:tc>
-        <w:tc>
-          <w:tcPr>
-            <w:tcW w:w="3338" w:type="dxa"/>
-            <w:vAlign w:val="center"/>
-          </w:tcPr>
-          <w:p>
-            <w:pPr>
-              <w:pStyle w:val="10"/>
-              <w:widowControl w:val="0"/>
-              <w:spacing w:before="0" w:beforeAutospacing="0" w:after="0" w:afterAutospacing="0" w:line="320" w:lineRule="exact"/>
-              <w:rPr>
-                <w:rFonts w:hAnsi="华文中宋"/>
-                <w:kern w:val="2"/>
-              </w:rPr>
-            </w:pPr>
-            <w:r>
-              <w:rPr>
-                <w:rFonts w:hint="eastAsia" w:hAnsi="华文中宋"/>
-                <w:kern w:val="2"/>
-              </w:rPr>
-              <w:t>刘飞强</w:t>
-            </w:r>
-          </w:p>
-        </w:tc>
-        <w:tc>
-          <w:tcPr>
-            <w:tcW w:w="1655" w:type="dxa"/>
-            <w:vAlign w:val="center"/>
-          </w:tcPr>
-          <w:p>
-            <w:pPr>
-              <w:spacing w:line="320" w:lineRule="exact"/>
-              <w:jc w:val="center"/>
-              <w:rPr>
-                <w:rFonts w:ascii="宋体" w:hAnsi="华文中宋"/>
-                <w:sz w:val="24"/>
-              </w:rPr>
-            </w:pPr>
-            <w:r>
-              <w:rPr>
-                <w:rFonts w:hint="eastAsia" w:ascii="宋体" w:hAnsi="华文中宋"/>
-                <w:sz w:val="24"/>
-              </w:rPr>
-              <w:t>成绩</w:t>
-            </w:r>
-          </w:p>
-        </w:tc>
-        <w:tc>
-          <w:tcPr>
-            <w:tcW w:w="2200" w:type="dxa"/>
-            <w:vAlign w:val="center"/>
-          </w:tcPr>
-          <w:p>
-            <w:pPr>
-              <w:spacing w:line="320" w:lineRule="exact"/>
-              <w:jc w:val="center"/>
-              <w:rPr>
-                <w:rFonts w:ascii="宋体" w:hAnsi="华文中宋"/>
-                <w:sz w:val="24"/>
-              </w:rPr>
-            </w:pPr>
-          </w:p>
-        </w:tc>
-      </w:tr>
-      <w:tr>
-        <w:tblPrEx>
-          <w:tblBorders>
-            <w:top w:val="single" w:color="auto" w:sz="4" w:space="0"/>
-            <w:left w:val="single" w:color="auto" w:sz="4" w:space="0"/>
-            <w:bottom w:val="single" w:color="auto" w:sz="4" w:space="0"/>
-            <w:right w:val="single" w:color="auto" w:sz="4" w:space="0"/>
-            <w:insideH w:val="single" w:color="auto" w:sz="4" w:space="0"/>
-            <w:insideV w:val="single" w:color="auto" w:sz="4" w:space="0"/>
-          </w:tblBorders>
-          <w:tblCellMar>
-            <w:top w:w="0" w:type="dxa"/>
-            <w:left w:w="108" w:type="dxa"/>
-            <w:bottom w:w="0" w:type="dxa"/>
-            <w:right w:w="108" w:type="dxa"/>
-          </w:tblCellMar>
-        </w:tblPrEx>
-        <w:trPr>
-          <w:cantSplit/>
+          <w:cantSplit w:val="1"/>
           <w:trHeight w:val="1108" w:hRule="atLeast"/>
           <w:jc w:val="center"/>
         </w:trPr>
@@ -556,7 +128,7 @@
             </w:pPr>
             <w:r>
               <w:rPr>
-                <w:rFonts w:ascii="宋体" w:hAnsi="宋体" w:eastAsia="宋体"/>
+                <w:rFonts w:hint="eastAsia" w:ascii="宋体" w:hAnsi="宋体" w:eastAsia="宋体"/>
                 <w:b w:val="0"/>
                 <w:sz w:val="24"/>
               </w:rPr>
@@ -569,7 +141,7 @@
             </w:pPr>
             <w:r>
               <w:rPr>
-                <w:rFonts w:ascii="宋体" w:hAnsi="宋体" w:eastAsia="宋体"/>
+                <w:rFonts w:hint="eastAsia" w:ascii="宋体" w:hAnsi="宋体" w:eastAsia="宋体"/>
                 <w:b w:val="0"/>
                 <w:sz w:val="24"/>
               </w:rPr>
@@ -582,7 +154,7 @@
             </w:pPr>
             <w:r>
               <w:rPr>
-                <w:rFonts w:ascii="宋体" w:hAnsi="宋体" w:eastAsia="宋体"/>
+                <w:rFonts w:hint="eastAsia" w:ascii="宋体" w:hAnsi="宋体" w:eastAsia="宋体"/>
                 <w:b w:val="0"/>
                 <w:sz w:val="24"/>
               </w:rPr>
@@ -595,7 +167,7 @@
             </w:pPr>
             <w:r>
               <w:rPr>
-                <w:rFonts w:ascii="宋体" w:hAnsi="宋体" w:eastAsia="宋体"/>
+                <w:rFonts w:hint="eastAsia" w:ascii="宋体" w:hAnsi="宋体" w:eastAsia="宋体"/>
                 <w:b w:val="0"/>
                 <w:sz w:val="24"/>
               </w:rPr>
@@ -608,7 +180,7 @@
             </w:pPr>
             <w:r>
               <w:rPr>
-                <w:rFonts w:ascii="宋体" w:hAnsi="宋体" w:eastAsia="宋体"/>
+                <w:rFonts w:hint="eastAsia" w:ascii="宋体" w:hAnsi="宋体" w:eastAsia="宋体"/>
                 <w:b w:val="0"/>
                 <w:sz w:val="24"/>
               </w:rPr>
@@ -618,24 +190,8 @@
         </w:tc>
       </w:tr>
       <w:tr>
-        <w:tblPrEx>
-          <w:tblBorders>
-            <w:top w:val="single" w:color="auto" w:sz="4" w:space="0"/>
-            <w:left w:val="single" w:color="auto" w:sz="4" w:space="0"/>
-            <w:bottom w:val="single" w:color="auto" w:sz="4" w:space="0"/>
-            <w:right w:val="single" w:color="auto" w:sz="4" w:space="0"/>
-            <w:insideH w:val="single" w:color="auto" w:sz="4" w:space="0"/>
-            <w:insideV w:val="single" w:color="auto" w:sz="4" w:space="0"/>
-          </w:tblBorders>
-          <w:tblCellMar>
-            <w:top w:w="0" w:type="dxa"/>
-            <w:left w:w="108" w:type="dxa"/>
-            <w:bottom w:w="0" w:type="dxa"/>
-            <w:right w:w="108" w:type="dxa"/>
-          </w:tblCellMar>
-        </w:tblPrEx>
         <w:trPr>
-          <w:cantSplit/>
+          <w:cantSplit w:val="1"/>
           <w:trHeight w:val="1782" w:hRule="atLeast"/>
           <w:jc w:val="center"/>
         </w:trPr>
@@ -669,7 +225,7 @@
             </w:pPr>
             <w:r>
               <w:rPr>
-                <w:rFonts w:ascii="宋体" w:hAnsi="宋体" w:eastAsia="宋体"/>
+                <w:rFonts w:hint="eastAsia" w:ascii="宋体" w:hAnsi="宋体" w:eastAsia="宋体"/>
                 <w:b w:val="0"/>
                 <w:sz w:val="24"/>
               </w:rPr>
@@ -682,7 +238,7 @@
             </w:pPr>
             <w:r>
               <w:rPr>
-                <w:rFonts w:ascii="宋体" w:hAnsi="宋体" w:eastAsia="宋体"/>
+                <w:rFonts w:hint="eastAsia" w:ascii="宋体" w:hAnsi="宋体" w:eastAsia="宋体"/>
                 <w:b w:val="0"/>
                 <w:sz w:val="24"/>
               </w:rPr>
@@ -695,7 +251,7 @@
             </w:pPr>
             <w:r>
               <w:rPr>
-                <w:rFonts w:ascii="宋体" w:hAnsi="宋体" w:eastAsia="宋体"/>
+                <w:rFonts w:hint="eastAsia" w:ascii="宋体" w:hAnsi="宋体" w:eastAsia="宋体"/>
                 <w:b w:val="0"/>
                 <w:sz w:val="24"/>
               </w:rPr>
@@ -708,7 +264,7 @@
             </w:pPr>
             <w:r>
               <w:rPr>
-                <w:rFonts w:ascii="宋体" w:hAnsi="宋体" w:eastAsia="宋体"/>
+                <w:rFonts w:hint="eastAsia" w:ascii="宋体" w:hAnsi="宋体" w:eastAsia="宋体"/>
                 <w:b w:val="0"/>
                 <w:sz w:val="24"/>
               </w:rPr>
@@ -721,7 +277,7 @@
             </w:pPr>
             <w:r>
               <w:rPr>
-                <w:rFonts w:ascii="宋体" w:hAnsi="宋体" w:eastAsia="宋体"/>
+                <w:rFonts w:hint="eastAsia" w:ascii="宋体" w:hAnsi="宋体" w:eastAsia="宋体"/>
                 <w:b w:val="0"/>
                 <w:sz w:val="24"/>
               </w:rPr>
@@ -734,7 +290,7 @@
             </w:pPr>
             <w:r>
               <w:rPr>
-                <w:rFonts w:ascii="宋体" w:hAnsi="宋体" w:eastAsia="宋体"/>
+                <w:rFonts w:hint="eastAsia" w:ascii="宋体" w:hAnsi="宋体" w:eastAsia="宋体"/>
                 <w:b w:val="0"/>
                 <w:sz w:val="24"/>
               </w:rPr>
@@ -747,7 +303,7 @@
             </w:pPr>
             <w:r>
               <w:rPr>
-                <w:rFonts w:ascii="宋体" w:hAnsi="宋体" w:eastAsia="宋体"/>
+                <w:rFonts w:hint="eastAsia" w:ascii="宋体" w:hAnsi="宋体" w:eastAsia="宋体"/>
                 <w:b w:val="0"/>
                 <w:sz w:val="24"/>
               </w:rPr>
@@ -760,7 +316,7 @@
             </w:pPr>
             <w:r>
               <w:rPr>
-                <w:rFonts w:ascii="宋体" w:hAnsi="宋体" w:eastAsia="宋体"/>
+                <w:rFonts w:hint="eastAsia" w:ascii="宋体" w:hAnsi="宋体" w:eastAsia="宋体"/>
                 <w:b w:val="0"/>
                 <w:sz w:val="24"/>
               </w:rPr>
@@ -799,7 +355,7 @@
             </w:pPr>
             <w:r>
               <w:rPr>
-                <w:rFonts w:ascii="宋体" w:hAnsi="宋体" w:eastAsia="宋体"/>
+                <w:rFonts w:hint="eastAsia" w:ascii="宋体" w:hAnsi="宋体" w:eastAsia="宋体"/>
                 <w:b w:val="0"/>
                 <w:sz w:val="24"/>
               </w:rPr>
@@ -809,24 +365,8 @@
         </w:tc>
       </w:tr>
       <w:tr>
-        <w:tblPrEx>
-          <w:tblBorders>
-            <w:top w:val="single" w:color="auto" w:sz="4" w:space="0"/>
-            <w:left w:val="single" w:color="auto" w:sz="4" w:space="0"/>
-            <w:bottom w:val="single" w:color="auto" w:sz="4" w:space="0"/>
-            <w:right w:val="single" w:color="auto" w:sz="4" w:space="0"/>
-            <w:insideH w:val="single" w:color="auto" w:sz="4" w:space="0"/>
-            <w:insideV w:val="single" w:color="auto" w:sz="4" w:space="0"/>
-          </w:tblBorders>
-          <w:tblCellMar>
-            <w:top w:w="0" w:type="dxa"/>
-            <w:left w:w="108" w:type="dxa"/>
-            <w:bottom w:w="0" w:type="dxa"/>
-            <w:right w:w="108" w:type="dxa"/>
-          </w:tblCellMar>
-        </w:tblPrEx>
         <w:trPr>
-          <w:cantSplit/>
+          <w:cantSplit w:val="1"/>
           <w:trHeight w:val="3599" w:hRule="atLeast"/>
           <w:jc w:val="center"/>
         </w:trPr>
@@ -860,7 +400,7 @@
             </w:pPr>
             <w:r>
               <w:rPr>
-                <w:rFonts w:ascii="宋体" w:hAnsi="宋体" w:eastAsia="宋体"/>
+                <w:rFonts w:hint="eastAsia" w:ascii="宋体" w:hAnsi="宋体" w:eastAsia="宋体"/>
                 <w:b w:val="0"/>
                 <w:sz w:val="24"/>
               </w:rPr>
@@ -879,7 +419,7 @@
             </w:pPr>
             <w:r>
               <w:rPr>
-                <w:rFonts w:ascii="宋体" w:hAnsi="宋体" w:eastAsia="宋体"/>
+                <w:rFonts w:hint="eastAsia" w:ascii="宋体" w:hAnsi="宋体" w:eastAsia="宋体"/>
                 <w:b w:val="0"/>
                 <w:sz w:val="24"/>
               </w:rPr>
@@ -896,7 +436,7 @@
             </w:r>
             <w:r>
               <w:rPr>
-                <w:rFonts w:ascii="宋体" w:hAnsi="宋体" w:eastAsia="宋体"/>
+                <w:rFonts w:hint="eastAsia" w:ascii="宋体" w:hAnsi="宋体" w:eastAsia="宋体"/>
                 <w:b w:val="0"/>
                 <w:sz w:val="24"/>
               </w:rPr>
@@ -910,7 +450,7 @@
             </w:pPr>
             <w:r>
               <w:rPr>
-                <w:rFonts w:ascii="宋体" w:hAnsi="宋体" w:eastAsia="宋体"/>
+                <w:rFonts w:hint="eastAsia" w:ascii="宋体" w:hAnsi="宋体" w:eastAsia="宋体"/>
                 <w:b w:val="0"/>
                 <w:sz w:val="24"/>
               </w:rPr>
@@ -923,7 +463,7 @@
             </w:pPr>
             <w:r>
               <w:rPr>
-                <w:rFonts w:ascii="宋体" w:hAnsi="宋体" w:eastAsia="宋体"/>
+                <w:rFonts w:hint="eastAsia" w:ascii="宋体" w:hAnsi="宋体" w:eastAsia="宋体"/>
                 <w:b w:val="0"/>
                 <w:sz w:val="24"/>
               </w:rPr>
@@ -936,7 +476,7 @@
             </w:pPr>
             <w:r>
               <w:rPr>
-                <w:rFonts w:ascii="宋体" w:hAnsi="宋体" w:eastAsia="宋体"/>
+                <w:rFonts w:hint="eastAsia" w:ascii="宋体" w:hAnsi="宋体" w:eastAsia="宋体"/>
                 <w:b w:val="0"/>
                 <w:sz w:val="24"/>
               </w:rPr>
@@ -949,7 +489,7 @@
             </w:pPr>
             <w:r>
               <w:rPr>
-                <w:rFonts w:ascii="宋体" w:hAnsi="宋体" w:eastAsia="宋体"/>
+                <w:rFonts w:hint="eastAsia" w:ascii="宋体" w:hAnsi="宋体" w:eastAsia="宋体"/>
                 <w:b w:val="0"/>
                 <w:sz w:val="24"/>
               </w:rPr>
@@ -962,7 +502,7 @@
             </w:pPr>
             <w:r>
               <w:rPr>
-                <w:rFonts w:ascii="宋体" w:hAnsi="宋体" w:eastAsia="宋体"/>
+                <w:rFonts w:hint="eastAsia" w:ascii="宋体" w:hAnsi="宋体" w:eastAsia="宋体"/>
                 <w:b w:val="0"/>
                 <w:sz w:val="24"/>
               </w:rPr>
@@ -972,24 +512,8 @@
         </w:tc>
       </w:tr>
       <w:tr>
-        <w:tblPrEx>
-          <w:tblBorders>
-            <w:top w:val="single" w:color="auto" w:sz="4" w:space="0"/>
-            <w:left w:val="single" w:color="auto" w:sz="4" w:space="0"/>
-            <w:bottom w:val="single" w:color="auto" w:sz="4" w:space="0"/>
-            <w:right w:val="single" w:color="auto" w:sz="4" w:space="0"/>
-            <w:insideH w:val="single" w:color="auto" w:sz="4" w:space="0"/>
-            <w:insideV w:val="single" w:color="auto" w:sz="4" w:space="0"/>
-          </w:tblBorders>
-          <w:tblCellMar>
-            <w:top w:w="0" w:type="dxa"/>
-            <w:left w:w="108" w:type="dxa"/>
-            <w:bottom w:w="0" w:type="dxa"/>
-            <w:right w:w="108" w:type="dxa"/>
-          </w:tblCellMar>
-        </w:tblPrEx>
         <w:trPr>
-          <w:cantSplit/>
+          <w:cantSplit w:val="1"/>
           <w:trHeight w:val="3599" w:hRule="atLeast"/>
           <w:jc w:val="center"/>
         </w:trPr>
@@ -1168,7 +692,7 @@
             </w:pPr>
             <w:r>
               <w:rPr>
-                <w:rFonts w:ascii="宋体" w:hAnsi="宋体" w:eastAsia="宋体"/>
+                <w:rFonts w:hint="eastAsia" w:ascii="宋体" w:hAnsi="宋体" w:eastAsia="宋体"/>
                 <w:b w:val="0"/>
                 <w:sz w:val="24"/>
               </w:rPr>
@@ -1207,7 +731,7 @@
             </w:pPr>
             <w:r>
               <w:rPr>
-                <w:rFonts w:ascii="宋体" w:hAnsi="宋体" w:eastAsia="宋体"/>
+                <w:rFonts w:hint="eastAsia" w:ascii="宋体" w:hAnsi="宋体" w:eastAsia="宋体"/>
                 <w:b w:val="0"/>
                 <w:sz w:val="24"/>
               </w:rPr>
@@ -1272,7 +796,7 @@
             </w:pPr>
             <w:r>
               <w:rPr>
-                <w:rFonts w:ascii="宋体" w:hAnsi="宋体" w:eastAsia="宋体"/>
+                <w:rFonts w:hint="eastAsia" w:ascii="宋体" w:hAnsi="宋体" w:eastAsia="宋体"/>
                 <w:b w:val="0"/>
                 <w:sz w:val="24"/>
               </w:rPr>
@@ -1311,7 +835,7 @@
             </w:pPr>
             <w:r>
               <w:rPr>
-                <w:rFonts w:ascii="宋体" w:hAnsi="宋体" w:eastAsia="宋体"/>
+                <w:rFonts w:hint="eastAsia" w:ascii="宋体" w:hAnsi="宋体" w:eastAsia="宋体"/>
                 <w:b w:val="0"/>
                 <w:sz w:val="24"/>
               </w:rPr>
@@ -1324,7 +848,7 @@
             </w:pPr>
             <w:r>
               <w:rPr>
-                <w:rFonts w:ascii="宋体" w:hAnsi="宋体" w:eastAsia="宋体"/>
+                <w:rFonts w:hint="eastAsia" w:ascii="宋体" w:hAnsi="宋体" w:eastAsia="宋体"/>
                 <w:b w:val="0"/>
                 <w:sz w:val="24"/>
               </w:rPr>
@@ -1363,7 +887,7 @@
             </w:pPr>
             <w:r>
               <w:rPr>
-                <w:rFonts w:ascii="宋体" w:hAnsi="宋体" w:eastAsia="宋体"/>
+                <w:rFonts w:hint="eastAsia" w:ascii="宋体" w:hAnsi="宋体" w:eastAsia="宋体"/>
                 <w:b w:val="0"/>
                 <w:sz w:val="24"/>
               </w:rPr>
@@ -1402,7 +926,7 @@
             </w:pPr>
             <w:r>
               <w:rPr>
-                <w:rFonts w:ascii="宋体" w:hAnsi="宋体" w:eastAsia="宋体"/>
+                <w:rFonts w:hint="eastAsia" w:ascii="宋体" w:hAnsi="宋体" w:eastAsia="宋体"/>
                 <w:b w:val="0"/>
                 <w:sz w:val="24"/>
               </w:rPr>
@@ -1441,7 +965,7 @@
             </w:pPr>
             <w:r>
               <w:rPr>
-                <w:rFonts w:ascii="宋体" w:hAnsi="宋体" w:eastAsia="宋体"/>
+                <w:rFonts w:hint="eastAsia" w:ascii="宋体" w:hAnsi="宋体" w:eastAsia="宋体"/>
                 <w:b w:val="0"/>
                 <w:sz w:val="24"/>
               </w:rPr>
@@ -1485,7 +1009,7 @@
             </w:pPr>
             <w:r>
               <w:rPr>
-                <w:rFonts w:ascii="宋体" w:hAnsi="宋体" w:eastAsia="宋体"/>
+                <w:rFonts w:hint="eastAsia" w:ascii="宋体" w:hAnsi="宋体" w:eastAsia="宋体"/>
                 <w:b w:val="0"/>
                 <w:sz w:val="24"/>
               </w:rPr>
@@ -1607,7 +1131,7 @@
             </w:pPr>
             <w:r>
               <w:rPr>
-                <w:rFonts w:ascii="宋体" w:hAnsi="宋体" w:eastAsia="宋体"/>
+                <w:rFonts w:hint="eastAsia" w:ascii="宋体" w:hAnsi="宋体" w:eastAsia="宋体"/>
                 <w:b w:val="0"/>
                 <w:sz w:val="24"/>
               </w:rPr>
@@ -1646,7 +1170,7 @@
             </w:pPr>
             <w:r>
               <w:rPr>
-                <w:rFonts w:ascii="宋体" w:hAnsi="宋体" w:eastAsia="宋体"/>
+                <w:rFonts w:hint="eastAsia" w:ascii="宋体" w:hAnsi="宋体" w:eastAsia="宋体"/>
                 <w:b w:val="0"/>
                 <w:sz w:val="24"/>
               </w:rPr>
@@ -1716,7 +1240,7 @@
             </w:pPr>
             <w:r>
               <w:rPr>
-                <w:rFonts w:ascii="宋体" w:hAnsi="宋体" w:eastAsia="宋体"/>
+                <w:rFonts w:hint="eastAsia" w:ascii="宋体" w:hAnsi="宋体" w:eastAsia="宋体"/>
                 <w:b w:val="0"/>
                 <w:sz w:val="24"/>
               </w:rPr>
@@ -1760,7 +1284,7 @@
             </w:pPr>
             <w:r>
               <w:rPr>
-                <w:rFonts w:ascii="宋体" w:hAnsi="宋体" w:eastAsia="宋体"/>
+                <w:rFonts w:hint="eastAsia" w:ascii="宋体" w:hAnsi="宋体" w:eastAsia="宋体"/>
                 <w:b w:val="0"/>
                 <w:sz w:val="24"/>
               </w:rPr>
@@ -1822,7 +1346,7 @@
             </w:pPr>
             <w:r>
               <w:rPr>
-                <w:rFonts w:ascii="宋体" w:hAnsi="宋体" w:eastAsia="宋体"/>
+                <w:rFonts w:hint="eastAsia" w:ascii="宋体" w:hAnsi="宋体" w:eastAsia="宋体"/>
                 <w:b w:val="0"/>
                 <w:sz w:val="24"/>
               </w:rPr>
@@ -1839,7 +1363,7 @@
             </w:r>
             <w:r>
               <w:rPr>
-                <w:rFonts w:ascii="宋体" w:hAnsi="宋体" w:eastAsia="宋体"/>
+                <w:rFonts w:hint="eastAsia" w:ascii="宋体" w:hAnsi="宋体" w:eastAsia="宋体"/>
                 <w:b w:val="0"/>
                 <w:sz w:val="24"/>
               </w:rPr>
@@ -2090,7 +1614,7 @@
             </w:pPr>
             <w:r>
               <w:rPr>
-                <w:rFonts w:ascii="宋体" w:hAnsi="宋体" w:eastAsia="宋体"/>
+                <w:rFonts w:hint="eastAsia" w:ascii="宋体" w:hAnsi="宋体" w:eastAsia="宋体"/>
                 <w:b w:val="0"/>
                 <w:sz w:val="24"/>
               </w:rPr>
@@ -2147,7 +1671,7 @@
             </w:pPr>
             <w:r>
               <w:rPr>
-                <w:rFonts w:ascii="宋体" w:hAnsi="宋体" w:eastAsia="宋体"/>
+                <w:rFonts w:hint="eastAsia" w:ascii="宋体" w:hAnsi="宋体" w:eastAsia="宋体"/>
                 <w:b w:val="0"/>
                 <w:sz w:val="24"/>
               </w:rPr>
@@ -2204,7 +1728,7 @@
             </w:pPr>
             <w:r>
               <w:rPr>
-                <w:rFonts w:ascii="宋体" w:hAnsi="宋体" w:eastAsia="宋体"/>
+                <w:rFonts w:hint="eastAsia" w:ascii="宋体" w:hAnsi="宋体" w:eastAsia="宋体"/>
                 <w:b w:val="0"/>
                 <w:sz w:val="24"/>
               </w:rPr>
@@ -2261,7 +1785,7 @@
             </w:pPr>
             <w:r>
               <w:rPr>
-                <w:rFonts w:ascii="宋体" w:hAnsi="宋体" w:eastAsia="宋体"/>
+                <w:rFonts w:hint="eastAsia" w:ascii="宋体" w:hAnsi="宋体" w:eastAsia="宋体"/>
                 <w:b w:val="0"/>
                 <w:sz w:val="24"/>
               </w:rPr>
@@ -2336,7 +1860,7 @@
             </w:pPr>
             <w:r>
               <w:rPr>
-                <w:rFonts w:ascii="宋体" w:hAnsi="宋体" w:eastAsia="宋体"/>
+                <w:rFonts w:hint="eastAsia" w:ascii="宋体" w:hAnsi="宋体" w:eastAsia="宋体"/>
                 <w:b w:val="0"/>
                 <w:sz w:val="24"/>
               </w:rPr>
@@ -2393,7 +1917,7 @@
             </w:pPr>
             <w:r>
               <w:rPr>
-                <w:rFonts w:ascii="宋体" w:hAnsi="宋体" w:eastAsia="宋体"/>
+                <w:rFonts w:hint="eastAsia" w:ascii="宋体" w:hAnsi="宋体" w:eastAsia="宋体"/>
                 <w:b w:val="0"/>
                 <w:sz w:val="24"/>
               </w:rPr>
@@ -2455,24 +1979,8 @@
         </w:tc>
       </w:tr>
       <w:tr>
-        <w:tblPrEx>
-          <w:tblBorders>
-            <w:top w:val="single" w:color="auto" w:sz="4" w:space="0"/>
-            <w:left w:val="single" w:color="auto" w:sz="4" w:space="0"/>
-            <w:bottom w:val="single" w:color="auto" w:sz="4" w:space="0"/>
-            <w:right w:val="single" w:color="auto" w:sz="4" w:space="0"/>
-            <w:insideH w:val="single" w:color="auto" w:sz="4" w:space="0"/>
-            <w:insideV w:val="single" w:color="auto" w:sz="4" w:space="0"/>
-          </w:tblBorders>
-          <w:tblCellMar>
-            <w:top w:w="0" w:type="dxa"/>
-            <w:left w:w="108" w:type="dxa"/>
-            <w:bottom w:w="0" w:type="dxa"/>
-            <w:right w:w="108" w:type="dxa"/>
-          </w:tblCellMar>
-        </w:tblPrEx>
         <w:trPr>
-          <w:cantSplit/>
+          <w:cantSplit w:val="1"/>
           <w:trHeight w:val="8142" w:hRule="atLeast"/>
           <w:jc w:val="center"/>
         </w:trPr>
@@ -2510,7 +2018,7 @@
             </w:pPr>
             <w:r>
               <w:rPr>
-                <w:rFonts w:ascii="宋体" w:hAnsi="宋体" w:eastAsia="宋体"/>
+                <w:rFonts w:hint="eastAsia" w:ascii="宋体" w:hAnsi="宋体" w:eastAsia="宋体"/>
                 <w:b w:val="0"/>
                 <w:sz w:val="24"/>
               </w:rPr>
@@ -2525,89 +2033,15 @@
                 <wp:inline distT="0" distB="0" distL="114300" distR="114300">
                   <wp:extent cx="5441315" cy="3018155"/>
                   <wp:effectExtent l="0" t="0" r="10160" b="4445"/>
-                  <wp:docPr id="1" name="图片 1" descr="2.1"/>
+                  <wp:docPr id="2" name="图片 1" descr="2.1"/>
                   <wp:cNvGraphicFramePr>
-                    <a:graphicFrameLocks xmlns:a="http://schemas.openxmlformats.org/drawingml/2006/main" noChangeAspect="1"/>
+                    <a:graphicFrameLocks noChangeAspect="1"/>
                   </wp:cNvGraphicFramePr>
-                  <a:graphic xmlns:a="http://schemas.openxmlformats.org/drawingml/2006/main">
+                  <a:graphic>
                     <a:graphicData uri="http://schemas.openxmlformats.org/drawingml/2006/picture">
-                      <pic:pic xmlns:pic="http://schemas.openxmlformats.org/drawingml/2006/picture">
+                      <pic:pic>
                         <pic:nvPicPr>
-                          <pic:cNvPr id="1" name="图片 1" descr="2.1"/>
-                          <pic:cNvPicPr>
-                            <a:picLocks noChangeAspect="1"/>
-                          </pic:cNvPicPr>
-                        </pic:nvPicPr>
-                        <pic:blipFill>
-                          <a:blip r:embed="rId6"/>
-                          <a:stretch>
-                            <a:fillRect/>
-                          </a:stretch>
-                        </pic:blipFill>
-                        <pic:spPr>
-                          <a:xfrm>
-                            <a:off x="0" y="0"/>
-                            <a:ext cx="5441315" cy="3018155"/>
-                          </a:xfrm>
-                          <a:prstGeom prst="rect">
-                            <a:avLst/>
-                          </a:prstGeom>
-                        </pic:spPr>
-                      </pic:pic>
-                    </a:graphicData>
-                  </a:graphic>
-                </wp:inline>
-              </w:drawing>
-            </w:r>
-          </w:p>
-          <w:p>
-            <w:pPr>
-              <w:spacing w:after="120" w:line="312" w:lineRule="auto"/>
-              <w:rPr>
-                <w:rFonts w:ascii="宋体" w:hAnsi="宋体" w:eastAsia="宋体"/>
-                <w:b w:val="0"/>
-                <w:sz w:val="24"/>
-              </w:rPr>
-            </w:pPr>
-            <w:r>
-              <w:rPr>
-                <w:rFonts w:ascii="宋体" w:hAnsi="宋体" w:eastAsia="宋体"/>
-                <w:b w:val="0"/>
-                <w:sz w:val="24"/>
-              </w:rPr>
-              <w:t>（2）第二组图（2×2）：依次显示加 40、减 40、乘 1.3、除 1.3 的结果。加 40 后图像整体变亮，减 40 后整体变暗，乘 1.3 后对比度增强、画面更鲜艳，除 1.3 后对比度降低、画面变灰暗。</w:t>
-            </w:r>
-          </w:p>
-          <w:p>
-            <w:pPr>
-              <w:spacing w:after="120" w:line="312" w:lineRule="auto"/>
-              <w:rPr>
-                <w:rFonts w:hint="eastAsia" w:ascii="宋体" w:hAnsi="宋体" w:eastAsia="宋体"/>
-                <w:b w:val="0"/>
-                <w:sz w:val="24"/>
-                <w:lang w:eastAsia="zh-CN"/>
-              </w:rPr>
-            </w:pPr>
-            <w:r>
-              <w:rPr>
-                <w:rFonts w:hint="eastAsia" w:ascii="宋体" w:hAnsi="宋体" w:eastAsia="宋体"/>
-                <w:b w:val="0"/>
-                <w:sz w:val="24"/>
-                <w:lang w:eastAsia="zh-CN"/>
-              </w:rPr>
-              <w:drawing>
-                <wp:inline distT="0" distB="0" distL="114300" distR="114300">
-                  <wp:extent cx="5441315" cy="3018155"/>
-                  <wp:effectExtent l="0" t="0" r="10160" b="4445"/>
-                  <wp:docPr id="2" name="图片 2" descr="2.2"/>
-                  <wp:cNvGraphicFramePr>
-                    <a:graphicFrameLocks xmlns:a="http://schemas.openxmlformats.org/drawingml/2006/main" noChangeAspect="1"/>
-                  </wp:cNvGraphicFramePr>
-                  <a:graphic xmlns:a="http://schemas.openxmlformats.org/drawingml/2006/main">
-                    <a:graphicData uri="http://schemas.openxmlformats.org/drawingml/2006/picture">
-                      <pic:pic xmlns:pic="http://schemas.openxmlformats.org/drawingml/2006/picture">
-                        <pic:nvPicPr>
-                          <pic:cNvPr id="2" name="图片 2" descr="2.2"/>
+                          <pic:cNvPr id="3" name="图片 1" descr="2.1"/>
                           <pic:cNvPicPr>
                             <a:picLocks noChangeAspect="1"/>
                           </pic:cNvPicPr>
@@ -2636,31 +2070,24 @@
           </w:p>
           <w:p>
             <w:pPr>
-              <w:numPr>
-                <w:ilvl w:val="0"/>
-                <w:numId w:val="1"/>
-              </w:numPr>
-              <w:spacing w:after="120" w:line="312" w:lineRule="auto"/>
-              <w:rPr>
-                <w:rFonts w:ascii="宋体" w:hAnsi="宋体" w:eastAsia="宋体"/>
-                <w:b w:val="0"/>
-                <w:sz w:val="24"/>
-              </w:rPr>
-            </w:pPr>
-            <w:r>
-              <w:rPr>
-                <w:rFonts w:ascii="宋体" w:hAnsi="宋体" w:eastAsia="宋体"/>
-                <w:b w:val="0"/>
-                <w:sz w:val="24"/>
-              </w:rPr>
-              <w:t>第三组图（1×2）：依次显示平移和旋转结果。平移后图像整体向右下偏移（tx=100、ty=50），左上侧出现黑色区域；旋转 45° 后图像绕中心旋转，四角被裁掉并填充为黑色，边缘出现锯齿。</w:t>
-            </w:r>
-          </w:p>
-          <w:p>
-            <w:pPr>
-              <w:numPr>
-                <w:numId w:val="0"/>
-              </w:numPr>
+              <w:spacing w:after="120" w:line="312" w:lineRule="auto"/>
+              <w:rPr>
+                <w:rFonts w:ascii="宋体" w:hAnsi="宋体" w:eastAsia="宋体"/>
+                <w:b w:val="0"/>
+                <w:sz w:val="24"/>
+              </w:rPr>
+            </w:pPr>
+            <w:r>
+              <w:rPr>
+                <w:rFonts w:hint="eastAsia" w:ascii="宋体" w:hAnsi="宋体" w:eastAsia="宋体"/>
+                <w:b w:val="0"/>
+                <w:sz w:val="24"/>
+              </w:rPr>
+              <w:t>（2）第二组图（2×2）：依次显示加 40、减 40、乘 1.3、除 1.3 的结果。加 40 后图像整体变亮，减 40 后整体变暗，乘 1.3 后对比度增强、画面更鲜艳，除 1.3 后对比度降低、画面变灰暗。</w:t>
+            </w:r>
+          </w:p>
+          <w:p>
+            <w:pPr>
               <w:spacing w:after="120" w:line="312" w:lineRule="auto"/>
               <w:rPr>
                 <w:rFonts w:hint="eastAsia" w:ascii="宋体" w:hAnsi="宋体" w:eastAsia="宋体"/>
@@ -2669,7 +2096,6 @@
                 <w:lang w:eastAsia="zh-CN"/>
               </w:rPr>
             </w:pPr>
-            <w:bookmarkStart w:id="1" w:name="_GoBack"/>
             <w:r>
               <w:rPr>
                 <w:rFonts w:hint="eastAsia" w:ascii="宋体" w:hAnsi="宋体" w:eastAsia="宋体"/>
@@ -2681,15 +2107,15 @@
                 <wp:inline distT="0" distB="0" distL="114300" distR="114300">
                   <wp:extent cx="5441315" cy="3018155"/>
                   <wp:effectExtent l="0" t="0" r="10160" b="4445"/>
-                  <wp:docPr id="3" name="图片 3" descr="2.3"/>
+                  <wp:docPr id="5" name="图片 2" descr="2.2"/>
                   <wp:cNvGraphicFramePr>
-                    <a:graphicFrameLocks xmlns:a="http://schemas.openxmlformats.org/drawingml/2006/main" noChangeAspect="1"/>
+                    <a:graphicFrameLocks noChangeAspect="1"/>
                   </wp:cNvGraphicFramePr>
-                  <a:graphic xmlns:a="http://schemas.openxmlformats.org/drawingml/2006/main">
+                  <a:graphic>
                     <a:graphicData uri="http://schemas.openxmlformats.org/drawingml/2006/picture">
-                      <pic:pic xmlns:pic="http://schemas.openxmlformats.org/drawingml/2006/picture">
+                      <pic:pic>
                         <pic:nvPicPr>
-                          <pic:cNvPr id="3" name="图片 3" descr="2.3"/>
+                          <pic:cNvPr id="6" name="图片 2" descr="2.2"/>
                           <pic:cNvPicPr>
                             <a:picLocks noChangeAspect="1"/>
                           </pic:cNvPicPr>
@@ -2715,6 +2141,88 @@
                 </wp:inline>
               </w:drawing>
             </w:r>
+          </w:p>
+          <w:p>
+            <w:pPr>
+              <w:numPr>
+                <w:ilvl w:val="0"/>
+                <w:numId w:val="1"/>
+              </w:numPr>
+              <w:spacing w:after="120" w:line="312" w:lineRule="auto"/>
+              <w:rPr>
+                <w:rFonts w:ascii="宋体" w:hAnsi="宋体" w:eastAsia="宋体"/>
+                <w:b w:val="0"/>
+                <w:sz w:val="24"/>
+              </w:rPr>
+            </w:pPr>
+            <w:r>
+              <w:rPr>
+                <w:rFonts w:hint="eastAsia" w:ascii="宋体" w:hAnsi="宋体" w:eastAsia="宋体"/>
+                <w:b w:val="0"/>
+                <w:sz w:val="24"/>
+              </w:rPr>
+              <w:t>第三组图（1×2）：依次显示平移和旋转结果。平移后图像整体向右下偏移（tx=100、ty=50），左上侧出现黑色区域；旋转 45° 后图像绕中心旋转，四角被裁掉并填充为黑色，边缘出现锯齿。</w:t>
+            </w:r>
+          </w:p>
+          <w:p>
+            <w:pPr>
+              <w:numPr>
+                <w:numId w:val="0"/>
+              </w:numPr>
+              <w:spacing w:after="120" w:line="312" w:lineRule="auto"/>
+              <w:rPr>
+                <w:rFonts w:hint="eastAsia" w:ascii="宋体" w:hAnsi="宋体" w:eastAsia="宋体"/>
+                <w:b w:val="0"/>
+                <w:sz w:val="24"/>
+                <w:lang w:eastAsia="zh-CN"/>
+              </w:rPr>
+            </w:pPr>
+            <w:bookmarkStart w:id="1" w:name="_GoBack"/>
+            <w:r>
+              <w:rPr>
+                <w:rFonts w:hint="eastAsia" w:ascii="宋体" w:hAnsi="宋体" w:eastAsia="宋体"/>
+                <w:b w:val="0"/>
+                <w:sz w:val="24"/>
+                <w:lang w:eastAsia="zh-CN"/>
+              </w:rPr>
+              <w:drawing>
+                <wp:inline distT="0" distB="0" distL="114300" distR="114300">
+                  <wp:extent cx="5441315" cy="3018155"/>
+                  <wp:effectExtent l="0" t="0" r="10160" b="4445"/>
+                  <wp:docPr id="8" name="图片 3" descr="2.3"/>
+                  <wp:cNvGraphicFramePr>
+                    <a:graphicFrameLocks noChangeAspect="1"/>
+                  </wp:cNvGraphicFramePr>
+                  <a:graphic>
+                    <a:graphicData uri="http://schemas.openxmlformats.org/drawingml/2006/picture">
+                      <pic:pic>
+                        <pic:nvPicPr>
+                          <pic:cNvPr id="9" name="图片 3" descr="2.3"/>
+                          <pic:cNvPicPr>
+                            <a:picLocks noChangeAspect="1"/>
+                          </pic:cNvPicPr>
+                        </pic:nvPicPr>
+                        <pic:blipFill>
+                          <a:blip r:embed="rId9"/>
+                          <a:stretch>
+                            <a:fillRect/>
+                          </a:stretch>
+                        </pic:blipFill>
+                        <pic:spPr>
+                          <a:xfrm>
+                            <a:off x="0" y="0"/>
+                            <a:ext cx="5441315" cy="3018155"/>
+                          </a:xfrm>
+                          <a:prstGeom prst="rect">
+                            <a:avLst/>
+                          </a:prstGeom>
+                        </pic:spPr>
+                      </pic:pic>
+                    </a:graphicData>
+                  </a:graphic>
+                </wp:inline>
+              </w:drawing>
+            </w:r>
             <w:bookmarkEnd w:id="1"/>
           </w:p>
           <w:p>
@@ -2723,8 +2231,8 @@
             </w:pPr>
             <w:r>
               <w:rPr>
-                <w:rFonts w:ascii="宋体" w:hAnsi="宋体" w:eastAsia="宋体"/>
-                <w:b/>
+                <w:rFonts w:hint="eastAsia" w:ascii="宋体" w:hAnsi="宋体" w:eastAsia="宋体"/>
+                <w:b w:val="1"/>
                 <w:sz w:val="24"/>
               </w:rPr>
               <w:t>6.实验结果分析</w:t>
@@ -2736,7 +2244,7 @@
             </w:pPr>
             <w:r>
               <w:rPr>
-                <w:rFonts w:ascii="宋体" w:hAnsi="宋体" w:eastAsia="宋体"/>
+                <w:rFonts w:hint="eastAsia" w:ascii="宋体" w:hAnsi="宋体" w:eastAsia="宋体"/>
                 <w:b w:val="0"/>
                 <w:sz w:val="24"/>
               </w:rPr>
@@ -2749,7 +2257,7 @@
             </w:pPr>
             <w:r>
               <w:rPr>
-                <w:rFonts w:ascii="宋体" w:hAnsi="宋体" w:eastAsia="宋体"/>
+                <w:rFonts w:hint="eastAsia" w:ascii="宋体" w:hAnsi="宋体" w:eastAsia="宋体"/>
                 <w:b w:val="0"/>
                 <w:sz w:val="24"/>
               </w:rPr>
@@ -2762,7 +2270,7 @@
             </w:pPr>
             <w:r>
               <w:rPr>
-                <w:rFonts w:ascii="宋体" w:hAnsi="宋体" w:eastAsia="宋体"/>
+                <w:rFonts w:hint="eastAsia" w:ascii="宋体" w:hAnsi="宋体" w:eastAsia="宋体"/>
                 <w:b w:val="0"/>
                 <w:sz w:val="24"/>
               </w:rPr>
@@ -2775,7 +2283,7 @@
             </w:pPr>
             <w:r>
               <w:rPr>
-                <w:rFonts w:ascii="宋体" w:hAnsi="宋体" w:eastAsia="宋体"/>
+                <w:rFonts w:hint="eastAsia" w:ascii="宋体" w:hAnsi="宋体" w:eastAsia="宋体"/>
                 <w:b w:val="0"/>
                 <w:sz w:val="24"/>
               </w:rPr>
@@ -2788,7 +2296,7 @@
             </w:pPr>
             <w:r>
               <w:rPr>
-                <w:rFonts w:ascii="宋体" w:hAnsi="宋体" w:eastAsia="宋体"/>
+                <w:rFonts w:hint="eastAsia" w:ascii="宋体" w:hAnsi="宋体" w:eastAsia="宋体"/>
                 <w:b w:val="0"/>
                 <w:sz w:val="24"/>
               </w:rPr>
@@ -2801,8 +2309,8 @@
     <w:p>
       <w:pPr>
         <w:rPr>
-          <w:b/>
-          <w:bCs/>
+          <w:b w:val="1"/>
+          <w:bCs w:val="1"/>
           <w:color w:val="C00000"/>
           <w:sz w:val="32"/>
           <w:szCs w:val="32"/>
@@ -2810,7 +2318,9 @@
         </w:rPr>
       </w:pPr>
     </w:p>
-    <w:p/>
+    <w:p>
+      <w:pPr/>
+    </w:p>
     <w:sectPr>
       <w:pgSz w:w="11906" w:h="16838"/>
       <w:pgMar w:top="1440" w:right="1800" w:bottom="1440" w:left="1800" w:header="851" w:footer="992" w:gutter="0"/>
@@ -2822,8 +2332,18 @@
 </file>
 
 <file path=word/endnotes.xml><?xml version="1.0" encoding="utf-8"?>
-<w:endnotes xmlns:wpc="http://schemas.microsoft.com/office/word/2010/wordprocessingCanvas" xmlns:mc="http://schemas.openxmlformats.org/markup-compatibility/2006" xmlns:o="urn:schemas-microsoft-com:office:office" xmlns:r="http://schemas.openxmlformats.org/officeDocument/2006/relationships" xmlns:m="http://schemas.openxmlformats.org/officeDocument/2006/math" xmlns:v="urn:schemas-microsoft-com:vml" xmlns:wp14="http://schemas.microsoft.com/office/word/2010/wordprocessingDrawing" xmlns:wp="http://schemas.openxmlformats.org/drawingml/2006/wordprocessingDrawing" xmlns:w="http://schemas.openxmlformats.org/wordprocessingml/2006/main" xmlns:w14="http://schemas.microsoft.com/office/word/2010/wordml" xmlns:w15="http://schemas.microsoft.com/office/word/2012/wordml" xmlns:w10="urn:schemas-microsoft-com:office:word" xmlns:wpg="http://schemas.microsoft.com/office/word/2010/wordprocessingGroup" xmlns:wpi="http://schemas.microsoft.com/office/word/2010/wordprocessingInk" xmlns:wne="http://schemas.microsoft.com/office/word/2006/wordml" xmlns:wps="http://schemas.microsoft.com/office/word/2010/wordprocessingShape" xmlns:wpsCustomData="http://www.wps.cn/officeDocument/2013/wpsCustomData" mc:Ignorable="w14 w15 wp14">
-  <w:endnote w:type="separator" w:id="0">
+<w:endnotes xmlns:w="http://schemas.openxmlformats.org/wordprocessingml/2006/main" xmlns:w14="http://schemas.microsoft.com/office/word/2010/wordml" xmlns:mc="http://schemas.openxmlformats.org/markup-compatibility/2006" mc:Ignorable="w14">
+  <w:endnote w:type="continuationSeparator" w:id="0">
+    <w:p>
+      <w:pPr>
+        <w:spacing w:line="240" w:lineRule="auto"/>
+      </w:pPr>
+      <w:r>
+        <w:continuationSeparator/>
+      </w:r>
+    </w:p>
+  </w:endnote>
+  <w:endnote w:type="separator" w:id="1">
     <w:p>
       <w:pPr>
         <w:spacing w:line="240" w:lineRule="auto"/>
@@ -2833,21 +2353,21 @@
       </w:r>
     </w:p>
   </w:endnote>
-  <w:endnote w:type="continuationSeparator" w:id="1">
+</w:endnotes>
+</file>
+
+<file path=word/footnotes.xml><?xml version="1.0" encoding="utf-8"?>
+<w:footnotes xmlns:w="http://schemas.openxmlformats.org/wordprocessingml/2006/main" xmlns:w14="http://schemas.microsoft.com/office/word/2010/wordml" xmlns:mc="http://schemas.openxmlformats.org/markup-compatibility/2006" mc:Ignorable="w14">
+  <w:footnote w:type="continuationSeparator" w:id="1">
     <w:p>
       <w:pPr>
-        <w:spacing w:line="240" w:lineRule="auto"/>
+        <w:spacing w:before="0" w:after="0" w:line="240" w:lineRule="auto"/>
       </w:pPr>
       <w:r>
         <w:continuationSeparator/>
       </w:r>
     </w:p>
-  </w:endnote>
-</w:endnotes>
-</file>
-
-<file path=word/footnotes.xml><?xml version="1.0" encoding="utf-8"?>
-<w:footnotes xmlns:wpc="http://schemas.microsoft.com/office/word/2010/wordprocessingCanvas" xmlns:mc="http://schemas.openxmlformats.org/markup-compatibility/2006" xmlns:o="urn:schemas-microsoft-com:office:office" xmlns:r="http://schemas.openxmlformats.org/officeDocument/2006/relationships" xmlns:m="http://schemas.openxmlformats.org/officeDocument/2006/math" xmlns:v="urn:schemas-microsoft-com:vml" xmlns:wp14="http://schemas.microsoft.com/office/word/2010/wordprocessingDrawing" xmlns:wp="http://schemas.openxmlformats.org/drawingml/2006/wordprocessingDrawing" xmlns:w="http://schemas.openxmlformats.org/wordprocessingml/2006/main" xmlns:w14="http://schemas.microsoft.com/office/word/2010/wordml" xmlns:w15="http://schemas.microsoft.com/office/word/2012/wordml" xmlns:w10="urn:schemas-microsoft-com:office:word" xmlns:wpg="http://schemas.microsoft.com/office/word/2010/wordprocessingGroup" xmlns:wpi="http://schemas.microsoft.com/office/word/2010/wordprocessingInk" xmlns:wne="http://schemas.microsoft.com/office/word/2006/wordml" xmlns:wps="http://schemas.microsoft.com/office/word/2010/wordprocessingShape" xmlns:wpsCustomData="http://www.wps.cn/officeDocument/2013/wpsCustomData" mc:Ignorable="w14 w15 wp14">
+  </w:footnote>
   <w:footnote w:type="separator" w:id="0">
     <w:p>
       <w:pPr>
@@ -2858,21 +2378,11 @@
       </w:r>
     </w:p>
   </w:footnote>
-  <w:footnote w:type="continuationSeparator" w:id="1">
-    <w:p>
-      <w:pPr>
-        <w:spacing w:before="0" w:after="0" w:line="240" w:lineRule="auto"/>
-      </w:pPr>
-      <w:r>
-        <w:continuationSeparator/>
-      </w:r>
-    </w:p>
-  </w:footnote>
 </w:footnotes>
 </file>
 
 <file path=word/numbering.xml><?xml version="1.0" encoding="utf-8"?>
-<w:numbering xmlns:wpc="http://schemas.microsoft.com/office/word/2010/wordprocessingCanvas" xmlns:mc="http://schemas.openxmlformats.org/markup-compatibility/2006" xmlns:o="urn:schemas-microsoft-com:office:office" xmlns:r="http://schemas.openxmlformats.org/officeDocument/2006/relationships" xmlns:m="http://schemas.openxmlformats.org/officeDocument/2006/math" xmlns:v="urn:schemas-microsoft-com:vml" xmlns:wp14="http://schemas.microsoft.com/office/word/2010/wordprocessingDrawing" xmlns:wp="http://schemas.openxmlformats.org/drawingml/2006/wordprocessingDrawing" xmlns:w10="urn:schemas-microsoft-com:office:word" xmlns:w="http://schemas.openxmlformats.org/wordprocessingml/2006/main" xmlns:w14="http://schemas.microsoft.com/office/word/2010/wordml" xmlns:wpg="http://schemas.microsoft.com/office/word/2010/wordprocessingGroup" xmlns:wpi="http://schemas.microsoft.com/office/word/2010/wordprocessingInk" xmlns:wne="http://schemas.microsoft.com/office/word/2006/wordml" xmlns:wps="http://schemas.microsoft.com/office/word/2010/wordprocessingShape" xmlns:wpsCustomData="http://www.wps.cn/officeDocument/2013/wpsCustomData" mc:Ignorable="w14 wp14">
+<w:numbering xmlns:w="http://schemas.openxmlformats.org/wordprocessingml/2006/main">
   <w:abstractNum w:abstractNumId="0">
     <w:nsid w:val="68F5CEDE"/>
     <w:multiLevelType w:val="singleLevel"/>
@@ -2892,7 +2402,7 @@
 </file>
 
 <file path=word/styles.xml><?xml version="1.0" encoding="utf-8"?>
-<w:styles xmlns:mc="http://schemas.openxmlformats.org/markup-compatibility/2006" xmlns:o="urn:schemas-microsoft-com:office:office" xmlns:r="http://schemas.openxmlformats.org/officeDocument/2006/relationships" xmlns:m="http://schemas.openxmlformats.org/officeDocument/2006/math" xmlns:v="urn:schemas-microsoft-com:vml" xmlns:w="http://schemas.openxmlformats.org/wordprocessingml/2006/main" xmlns:w14="http://schemas.microsoft.com/office/word/2010/wordml" xmlns:w10="urn:schemas-microsoft-com:office:word" xmlns:sl="http://schemas.openxmlformats.org/schemaLibrary/2006/main" xmlns:wpsCustomData="http://www.wps.cn/officeDocument/2013/wpsCustomData" mc:Ignorable="w14">
+<w:styles xmlns:w="http://schemas.openxmlformats.org/wordprocessingml/2006/main" xmlns:w14="http://schemas.microsoft.com/office/word/2010/wordml" xmlns:mc="http://schemas.openxmlformats.org/markup-compatibility/2006" mc:Ignorable="w14">
   <w:docDefaults>
     <w:rPrDefault>
       <w:rPr>
@@ -2901,361 +2411,270 @@
     </w:rPrDefault>
     <w:pPrDefault/>
   </w:docDefaults>
-  <w:latentStyles w:count="260" w:defQFormat="0" w:defUnhideWhenUsed="1" w:defSemiHidden="1" w:defUIPriority="99" w:defLockedState="0">
-    <w:lsdException w:qFormat="1" w:unhideWhenUsed="0" w:uiPriority="0" w:semiHidden="0" w:name="Normal"/>
-    <w:lsdException w:qFormat="1" w:unhideWhenUsed="0" w:uiPriority="9" w:semiHidden="0" w:name="heading 1"/>
-    <w:lsdException w:qFormat="1" w:uiPriority="9" w:name="heading 2"/>
-    <w:lsdException w:qFormat="1" w:uiPriority="9" w:name="heading 3"/>
-    <w:lsdException w:qFormat="1" w:uiPriority="9" w:name="heading 4"/>
-    <w:lsdException w:qFormat="1" w:uiPriority="9" w:name="heading 5"/>
-    <w:lsdException w:qFormat="1" w:uiPriority="9" w:name="heading 6"/>
-    <w:lsdException w:qFormat="1" w:uiPriority="9" w:name="heading 7"/>
-    <w:lsdException w:qFormat="1" w:uiPriority="9" w:name="heading 8"/>
-    <w:lsdException w:qFormat="1" w:uiPriority="9" w:name="heading 9"/>
-    <w:lsdException w:uiPriority="99" w:name="index 1"/>
-    <w:lsdException w:uiPriority="99" w:name="index 2"/>
-    <w:lsdException w:uiPriority="99" w:name="index 3"/>
-    <w:lsdException w:uiPriority="99" w:name="index 4"/>
-    <w:lsdException w:uiPriority="99" w:name="index 5"/>
-    <w:lsdException w:uiPriority="99" w:name="index 6"/>
-    <w:lsdException w:uiPriority="99" w:name="index 7"/>
-    <w:lsdException w:uiPriority="99" w:name="index 8"/>
-    <w:lsdException w:uiPriority="99" w:name="index 9"/>
-    <w:lsdException w:uiPriority="39" w:name="toc 1"/>
-    <w:lsdException w:uiPriority="39" w:name="toc 2"/>
-    <w:lsdException w:uiPriority="39" w:name="toc 3"/>
-    <w:lsdException w:uiPriority="39" w:name="toc 4"/>
-    <w:lsdException w:uiPriority="39" w:name="toc 5"/>
-    <w:lsdException w:uiPriority="39" w:name="toc 6"/>
-    <w:lsdException w:uiPriority="39" w:name="toc 7"/>
-    <w:lsdException w:uiPriority="39" w:name="toc 8"/>
-    <w:lsdException w:uiPriority="39" w:name="toc 9"/>
-    <w:lsdException w:uiPriority="99" w:name="Normal Indent"/>
-    <w:lsdException w:uiPriority="99" w:name="footnote text"/>
-    <w:lsdException w:uiPriority="99" w:name="annotation text"/>
-    <w:lsdException w:uiPriority="99" w:semiHidden="0" w:name="header"/>
-    <w:lsdException w:uiPriority="99" w:semiHidden="0" w:name="footer"/>
-    <w:lsdException w:uiPriority="99" w:name="index heading"/>
-    <w:lsdException w:qFormat="1" w:uiPriority="35" w:name="caption"/>
-    <w:lsdException w:uiPriority="99" w:name="table of figures"/>
-    <w:lsdException w:uiPriority="99" w:name="envelope address"/>
-    <w:lsdException w:uiPriority="99" w:name="envelope return"/>
-    <w:lsdException w:uiPriority="99" w:name="footnote reference"/>
-    <w:lsdException w:uiPriority="99" w:name="annotation reference"/>
-    <w:lsdException w:uiPriority="99" w:name="line number"/>
-    <w:lsdException w:uiPriority="99" w:name="page number"/>
-    <w:lsdException w:uiPriority="99" w:name="endnote reference"/>
-    <w:lsdException w:uiPriority="99" w:name="endnote text"/>
-    <w:lsdException w:uiPriority="99" w:name="table of authorities"/>
-    <w:lsdException w:uiPriority="99" w:name="macro"/>
-    <w:lsdException w:uiPriority="99" w:name="toa heading"/>
-    <w:lsdException w:uiPriority="99" w:name="List"/>
-    <w:lsdException w:uiPriority="99" w:name="List Bullet"/>
-    <w:lsdException w:uiPriority="99" w:name="List Number"/>
-    <w:lsdException w:uiPriority="99" w:name="List 2"/>
-    <w:lsdException w:uiPriority="99" w:name="List 3"/>
-    <w:lsdException w:uiPriority="99" w:name="List 4"/>
-    <w:lsdException w:uiPriority="99" w:name="List 5"/>
-    <w:lsdException w:uiPriority="99" w:name="List Bullet 2"/>
-    <w:lsdException w:uiPriority="99" w:name="List Bullet 3"/>
-    <w:lsdException w:uiPriority="99" w:name="List Bullet 4"/>
-    <w:lsdException w:uiPriority="99" w:name="List Bullet 5"/>
-    <w:lsdException w:uiPriority="99" w:name="List Number 2"/>
-    <w:lsdException w:uiPriority="99" w:name="List Number 3"/>
-    <w:lsdException w:uiPriority="99" w:name="List Number 4"/>
-    <w:lsdException w:uiPriority="99" w:name="List Number 5"/>
-    <w:lsdException w:qFormat="1" w:unhideWhenUsed="0" w:uiPriority="10" w:semiHidden="0" w:name="Title"/>
-    <w:lsdException w:uiPriority="99" w:name="Closing"/>
-    <w:lsdException w:uiPriority="99" w:name="Signature"/>
-    <w:lsdException w:qFormat="1" w:uiPriority="1" w:name="Default Paragraph Font"/>
-    <w:lsdException w:uiPriority="99" w:name="Body Text"/>
-    <w:lsdException w:uiPriority="99" w:name="Body Text Indent"/>
-    <w:lsdException w:uiPriority="99" w:name="List Continue"/>
-    <w:lsdException w:uiPriority="99" w:name="List Continue 2"/>
-    <w:lsdException w:uiPriority="99" w:name="List Continue 3"/>
-    <w:lsdException w:uiPriority="99" w:name="List Continue 4"/>
-    <w:lsdException w:uiPriority="99" w:name="List Continue 5"/>
-    <w:lsdException w:uiPriority="99" w:name="Message Header"/>
-    <w:lsdException w:qFormat="1" w:unhideWhenUsed="0" w:uiPriority="11" w:semiHidden="0" w:name="Subtitle"/>
-    <w:lsdException w:uiPriority="99" w:name="Salutation"/>
-    <w:lsdException w:uiPriority="99" w:name="Date"/>
-    <w:lsdException w:uiPriority="99" w:name="Body Text First Indent"/>
-    <w:lsdException w:uiPriority="99" w:name="Body Text First Indent 2"/>
-    <w:lsdException w:uiPriority="99" w:name="Note Heading"/>
-    <w:lsdException w:uiPriority="99" w:name="Body Text 2"/>
-    <w:lsdException w:uiPriority="99" w:name="Body Text 3"/>
-    <w:lsdException w:uiPriority="99" w:name="Body Text Indent 2"/>
-    <w:lsdException w:uiPriority="99" w:name="Body Text Indent 3"/>
-    <w:lsdException w:uiPriority="99" w:name="Block Text"/>
-    <w:lsdException w:uiPriority="99" w:name="Hyperlink"/>
-    <w:lsdException w:uiPriority="99" w:name="FollowedHyperlink"/>
-    <w:lsdException w:qFormat="1" w:unhideWhenUsed="0" w:uiPriority="22" w:semiHidden="0" w:name="Strong"/>
-    <w:lsdException w:qFormat="1" w:unhideWhenUsed="0" w:uiPriority="20" w:semiHidden="0" w:name="Emphasis"/>
-    <w:lsdException w:uiPriority="99" w:name="Document Map"/>
-    <w:lsdException w:uiPriority="99" w:name="Plain Text"/>
-    <w:lsdException w:uiPriority="99" w:name="E-mail Signature"/>
-    <w:lsdException w:uiPriority="99" w:name="Normal (Web)"/>
-    <w:lsdException w:uiPriority="99" w:name="HTML Acronym"/>
-    <w:lsdException w:uiPriority="99" w:name="HTML Address"/>
-    <w:lsdException w:uiPriority="99" w:name="HTML Cite"/>
-    <w:lsdException w:uiPriority="99" w:name="HTML Code"/>
-    <w:lsdException w:uiPriority="99" w:name="HTML Definition"/>
-    <w:lsdException w:uiPriority="99" w:name="HTML Keyboard"/>
-    <w:lsdException w:uiPriority="99" w:name="HTML Preformatted"/>
-    <w:lsdException w:uiPriority="99" w:name="HTML Sample"/>
-    <w:lsdException w:uiPriority="99" w:name="HTML Typewriter"/>
-    <w:lsdException w:uiPriority="99" w:name="HTML Variable"/>
-    <w:lsdException w:qFormat="1" w:uiPriority="99" w:name="Normal Table"/>
-    <w:lsdException w:uiPriority="99" w:name="annotation subject"/>
-    <w:lsdException w:uiPriority="99" w:name="Table Simple 1"/>
-    <w:lsdException w:uiPriority="99" w:name="Table Simple 2"/>
-    <w:lsdException w:uiPriority="99" w:name="Table Simple 3"/>
-    <w:lsdException w:uiPriority="99" w:name="Table Classic 1"/>
-    <w:lsdException w:uiPriority="99" w:name="Table Classic 2"/>
-    <w:lsdException w:uiPriority="99" w:name="Table Classic 3"/>
-    <w:lsdException w:uiPriority="99" w:name="Table Classic 4"/>
-    <w:lsdException w:uiPriority="99" w:name="Table Colorful 1"/>
-    <w:lsdException w:uiPriority="99" w:name="Table Colorful 2"/>
-    <w:lsdException w:uiPriority="99" w:name="Table Colorful 3"/>
-    <w:lsdException w:uiPriority="99" w:name="Table Columns 1"/>
-    <w:lsdException w:uiPriority="99" w:name="Table Columns 2"/>
-    <w:lsdException w:uiPriority="99" w:name="Table Columns 3"/>
-    <w:lsdException w:uiPriority="99" w:name="Table Columns 4"/>
-    <w:lsdException w:uiPriority="99" w:name="Table Columns 5"/>
-    <w:lsdException w:uiPriority="99" w:name="Table Grid 1"/>
-    <w:lsdException w:uiPriority="99" w:name="Table Grid 2"/>
-    <w:lsdException w:uiPriority="99" w:name="Table Grid 3"/>
-    <w:lsdException w:uiPriority="99" w:name="Table Grid 4"/>
-    <w:lsdException w:uiPriority="99" w:name="Table Grid 5"/>
-    <w:lsdException w:uiPriority="99" w:name="Table Grid 6"/>
-    <w:lsdException w:uiPriority="99" w:name="Table Grid 7"/>
-    <w:lsdException w:uiPriority="99" w:name="Table Grid 8"/>
-    <w:lsdException w:uiPriority="99" w:name="Table List 1"/>
-    <w:lsdException w:uiPriority="99" w:name="Table List 2"/>
-    <w:lsdException w:uiPriority="99" w:name="Table List 3"/>
-    <w:lsdException w:uiPriority="99" w:name="Table List 4"/>
-    <w:lsdException w:uiPriority="99" w:name="Table List 5"/>
-    <w:lsdException w:uiPriority="99" w:name="Table List 6"/>
-    <w:lsdException w:uiPriority="99" w:name="Table List 7"/>
-    <w:lsdException w:uiPriority="99" w:name="Table List 8"/>
-    <w:lsdException w:uiPriority="99" w:name="Table 3D effects 1"/>
-    <w:lsdException w:uiPriority="99" w:name="Table 3D effects 2"/>
-    <w:lsdException w:uiPriority="99" w:name="Table 3D effects 3"/>
-    <w:lsdException w:uiPriority="99" w:name="Table Contemporary"/>
-    <w:lsdException w:uiPriority="99" w:name="Table Elegant"/>
-    <w:lsdException w:uiPriority="99" w:name="Table Professional"/>
-    <w:lsdException w:uiPriority="99" w:name="Table Subtle 1"/>
-    <w:lsdException w:uiPriority="99" w:name="Table Subtle 2"/>
-    <w:lsdException w:uiPriority="99" w:name="Table Web 1"/>
-    <w:lsdException w:uiPriority="99" w:name="Table Web 2"/>
-    <w:lsdException w:uiPriority="99" w:name="Table Web 3"/>
-    <w:lsdException w:uiPriority="99" w:name="Balloon Text"/>
-    <w:lsdException w:unhideWhenUsed="0" w:uiPriority="39" w:semiHidden="0" w:name="Table Grid"/>
-    <w:lsdException w:uiPriority="99" w:name="Table Theme"/>
-    <w:lsdException w:unhideWhenUsed="0" w:uiPriority="60" w:semiHidden="0" w:name="Light Shading"/>
-    <w:lsdException w:unhideWhenUsed="0" w:uiPriority="61" w:semiHidden="0" w:name="Light List"/>
-    <w:lsdException w:unhideWhenUsed="0" w:uiPriority="62" w:semiHidden="0" w:name="Light Grid"/>
-    <w:lsdException w:unhideWhenUsed="0" w:uiPriority="63" w:semiHidden="0" w:name="Medium Shading 1"/>
-    <w:lsdException w:unhideWhenUsed="0" w:uiPriority="64" w:semiHidden="0" w:name="Medium Shading 2"/>
-    <w:lsdException w:unhideWhenUsed="0" w:uiPriority="65" w:semiHidden="0" w:name="Medium List 1"/>
-    <w:lsdException w:unhideWhenUsed="0" w:uiPriority="66" w:semiHidden="0" w:name="Medium List 2"/>
-    <w:lsdException w:unhideWhenUsed="0" w:uiPriority="67" w:semiHidden="0" w:name="Medium Grid 1"/>
-    <w:lsdException w:unhideWhenUsed="0" w:uiPriority="68" w:semiHidden="0" w:name="Medium Grid 2"/>
-    <w:lsdException w:unhideWhenUsed="0" w:uiPriority="69" w:semiHidden="0" w:name="Medium Grid 3"/>
-    <w:lsdException w:unhideWhenUsed="0" w:uiPriority="70" w:semiHidden="0" w:name="Dark List"/>
-    <w:lsdException w:unhideWhenUsed="0" w:uiPriority="71" w:semiHidden="0" w:name="Colorful Shading"/>
-    <w:lsdException w:unhideWhenUsed="0" w:uiPriority="72" w:semiHidden="0" w:name="Colorful List"/>
-    <w:lsdException w:unhideWhenUsed="0" w:uiPriority="73" w:semiHidden="0" w:name="Colorful Grid"/>
-    <w:lsdException w:unhideWhenUsed="0" w:uiPriority="60" w:semiHidden="0" w:name="Light Shading Accent 1"/>
-    <w:lsdException w:unhideWhenUsed="0" w:uiPriority="61" w:semiHidden="0" w:name="Light List Accent 1"/>
-    <w:lsdException w:unhideWhenUsed="0" w:uiPriority="62" w:semiHidden="0" w:name="Light Grid Accent 1"/>
-    <w:lsdException w:unhideWhenUsed="0" w:uiPriority="63" w:semiHidden="0" w:name="Medium Shading 1 Accent 1"/>
-    <w:lsdException w:unhideWhenUsed="0" w:uiPriority="64" w:semiHidden="0" w:name="Medium Shading 2 Accent 1"/>
-    <w:lsdException w:unhideWhenUsed="0" w:uiPriority="65" w:semiHidden="0" w:name="Medium List 1 Accent 1"/>
-    <w:lsdException w:qFormat="1" w:unhideWhenUsed="0" w:uiPriority="34" w:semiHidden="0" w:name="List Paragraph"/>
-    <w:lsdException w:unhideWhenUsed="0" w:uiPriority="66" w:semiHidden="0" w:name="Medium List 2 Accent 1"/>
-    <w:lsdException w:unhideWhenUsed="0" w:uiPriority="67" w:semiHidden="0" w:name="Medium Grid 1 Accent 1"/>
-    <w:lsdException w:unhideWhenUsed="0" w:uiPriority="68" w:semiHidden="0" w:name="Medium Grid 2 Accent 1"/>
-    <w:lsdException w:unhideWhenUsed="0" w:uiPriority="69" w:semiHidden="0" w:name="Medium Grid 3 Accent 1"/>
-    <w:lsdException w:unhideWhenUsed="0" w:uiPriority="70" w:semiHidden="0" w:name="Dark List Accent 1"/>
-    <w:lsdException w:unhideWhenUsed="0" w:uiPriority="71" w:semiHidden="0" w:name="Colorful Shading Accent 1"/>
-    <w:lsdException w:unhideWhenUsed="0" w:uiPriority="72" w:semiHidden="0" w:name="Colorful List Accent 1"/>
-    <w:lsdException w:unhideWhenUsed="0" w:uiPriority="73" w:semiHidden="0" w:name="Colorful Grid Accent 1"/>
-    <w:lsdException w:unhideWhenUsed="0" w:uiPriority="60" w:semiHidden="0" w:name="Light Shading Accent 2"/>
-    <w:lsdException w:unhideWhenUsed="0" w:uiPriority="61" w:semiHidden="0" w:name="Light List Accent 2"/>
-    <w:lsdException w:unhideWhenUsed="0" w:uiPriority="62" w:semiHidden="0" w:name="Light Grid Accent 2"/>
-    <w:lsdException w:unhideWhenUsed="0" w:uiPriority="63" w:semiHidden="0" w:name="Medium Shading 1 Accent 2"/>
-    <w:lsdException w:unhideWhenUsed="0" w:uiPriority="64" w:semiHidden="0" w:name="Medium Shading 2 Accent 2"/>
-    <w:lsdException w:unhideWhenUsed="0" w:uiPriority="65" w:semiHidden="0" w:name="Medium List 1 Accent 2"/>
-    <w:lsdException w:unhideWhenUsed="0" w:uiPriority="66" w:semiHidden="0" w:name="Medium List 2 Accent 2"/>
-    <w:lsdException w:unhideWhenUsed="0" w:uiPriority="67" w:semiHidden="0" w:name="Medium Grid 1 Accent 2"/>
-    <w:lsdException w:unhideWhenUsed="0" w:uiPriority="68" w:semiHidden="0" w:name="Medium Grid 2 Accent 2"/>
-    <w:lsdException w:unhideWhenUsed="0" w:uiPriority="69" w:semiHidden="0" w:name="Medium Grid 3 Accent 2"/>
-    <w:lsdException w:unhideWhenUsed="0" w:uiPriority="70" w:semiHidden="0" w:name="Dark List Accent 2"/>
-    <w:lsdException w:unhideWhenUsed="0" w:uiPriority="71" w:semiHidden="0" w:name="Colorful Shading Accent 2"/>
-    <w:lsdException w:unhideWhenUsed="0" w:uiPriority="72" w:semiHidden="0" w:name="Colorful List Accent 2"/>
-    <w:lsdException w:unhideWhenUsed="0" w:uiPriority="73" w:semiHidden="0" w:name="Colorful Grid Accent 2"/>
-    <w:lsdException w:unhideWhenUsed="0" w:uiPriority="60" w:semiHidden="0" w:name="Light Shading Accent 3"/>
-    <w:lsdException w:unhideWhenUsed="0" w:uiPriority="61" w:semiHidden="0" w:name="Light List Accent 3"/>
-    <w:lsdException w:unhideWhenUsed="0" w:uiPriority="62" w:semiHidden="0" w:name="Light Grid Accent 3"/>
-    <w:lsdException w:unhideWhenUsed="0" w:uiPriority="63" w:semiHidden="0" w:name="Medium Shading 1 Accent 3"/>
-    <w:lsdException w:unhideWhenUsed="0" w:uiPriority="64" w:semiHidden="0" w:name="Medium Shading 2 Accent 3"/>
-    <w:lsdException w:unhideWhenUsed="0" w:uiPriority="65" w:semiHidden="0" w:name="Medium List 1 Accent 3"/>
-    <w:lsdException w:unhideWhenUsed="0" w:uiPriority="66" w:semiHidden="0" w:name="Medium List 2 Accent 3"/>
-    <w:lsdException w:unhideWhenUsed="0" w:uiPriority="67" w:semiHidden="0" w:name="Medium Grid 1 Accent 3"/>
-    <w:lsdException w:unhideWhenUsed="0" w:uiPriority="68" w:semiHidden="0" w:name="Medium Grid 2 Accent 3"/>
-    <w:lsdException w:unhideWhenUsed="0" w:uiPriority="69" w:semiHidden="0" w:name="Medium Grid 3 Accent 3"/>
-    <w:lsdException w:unhideWhenUsed="0" w:uiPriority="70" w:semiHidden="0" w:name="Dark List Accent 3"/>
-    <w:lsdException w:unhideWhenUsed="0" w:uiPriority="71" w:semiHidden="0" w:name="Colorful Shading Accent 3"/>
-    <w:lsdException w:unhideWhenUsed="0" w:uiPriority="72" w:semiHidden="0" w:name="Colorful List Accent 3"/>
-    <w:lsdException w:unhideWhenUsed="0" w:uiPriority="73" w:semiHidden="0" w:name="Colorful Grid Accent 3"/>
-    <w:lsdException w:unhideWhenUsed="0" w:uiPriority="60" w:semiHidden="0" w:name="Light Shading Accent 4"/>
-    <w:lsdException w:unhideWhenUsed="0" w:uiPriority="61" w:semiHidden="0" w:name="Light List Accent 4"/>
-    <w:lsdException w:unhideWhenUsed="0" w:uiPriority="62" w:semiHidden="0" w:name="Light Grid Accent 4"/>
-    <w:lsdException w:unhideWhenUsed="0" w:uiPriority="63" w:semiHidden="0" w:name="Medium Shading 1 Accent 4"/>
-    <w:lsdException w:unhideWhenUsed="0" w:uiPriority="64" w:semiHidden="0" w:name="Medium Shading 2 Accent 4"/>
-    <w:lsdException w:unhideWhenUsed="0" w:uiPriority="65" w:semiHidden="0" w:name="Medium List 1 Accent 4"/>
-    <w:lsdException w:unhideWhenUsed="0" w:uiPriority="66" w:semiHidden="0" w:name="Medium List 2 Accent 4"/>
-    <w:lsdException w:unhideWhenUsed="0" w:uiPriority="67" w:semiHidden="0" w:name="Medium Grid 1 Accent 4"/>
-    <w:lsdException w:unhideWhenUsed="0" w:uiPriority="68" w:semiHidden="0" w:name="Medium Grid 2 Accent 4"/>
-    <w:lsdException w:unhideWhenUsed="0" w:uiPriority="69" w:semiHidden="0" w:name="Medium Grid 3 Accent 4"/>
-    <w:lsdException w:unhideWhenUsed="0" w:uiPriority="70" w:semiHidden="0" w:name="Dark List Accent 4"/>
-    <w:lsdException w:unhideWhenUsed="0" w:uiPriority="71" w:semiHidden="0" w:name="Colorful Shading Accent 4"/>
-    <w:lsdException w:unhideWhenUsed="0" w:uiPriority="72" w:semiHidden="0" w:name="Colorful List Accent 4"/>
-    <w:lsdException w:unhideWhenUsed="0" w:uiPriority="73" w:semiHidden="0" w:name="Colorful Grid Accent 4"/>
-    <w:lsdException w:unhideWhenUsed="0" w:uiPriority="60" w:semiHidden="0" w:name="Light Shading Accent 5"/>
-    <w:lsdException w:unhideWhenUsed="0" w:uiPriority="61" w:semiHidden="0" w:name="Light List Accent 5"/>
-    <w:lsdException w:unhideWhenUsed="0" w:uiPriority="62" w:semiHidden="0" w:name="Light Grid Accent 5"/>
-    <w:lsdException w:unhideWhenUsed="0" w:uiPriority="63" w:semiHidden="0" w:name="Medium Shading 1 Accent 5"/>
-    <w:lsdException w:unhideWhenUsed="0" w:uiPriority="64" w:semiHidden="0" w:name="Medium Shading 2 Accent 5"/>
-    <w:lsdException w:unhideWhenUsed="0" w:uiPriority="65" w:semiHidden="0" w:name="Medium List 1 Accent 5"/>
-    <w:lsdException w:unhideWhenUsed="0" w:uiPriority="66" w:semiHidden="0" w:name="Medium List 2 Accent 5"/>
-    <w:lsdException w:unhideWhenUsed="0" w:uiPriority="67" w:semiHidden="0" w:name="Medium Grid 1 Accent 5"/>
-    <w:lsdException w:unhideWhenUsed="0" w:uiPriority="68" w:semiHidden="0" w:name="Medium Grid 2 Accent 5"/>
-    <w:lsdException w:unhideWhenUsed="0" w:uiPriority="69" w:semiHidden="0" w:name="Medium Grid 3 Accent 5"/>
-    <w:lsdException w:unhideWhenUsed="0" w:uiPriority="70" w:semiHidden="0" w:name="Dark List Accent 5"/>
-    <w:lsdException w:unhideWhenUsed="0" w:uiPriority="71" w:semiHidden="0" w:name="Colorful Shading Accent 5"/>
-    <w:lsdException w:unhideWhenUsed="0" w:uiPriority="72" w:semiHidden="0" w:name="Colorful List Accent 5"/>
-    <w:lsdException w:unhideWhenUsed="0" w:uiPriority="73" w:semiHidden="0" w:name="Colorful Grid Accent 5"/>
-    <w:lsdException w:unhideWhenUsed="0" w:uiPriority="60" w:semiHidden="0" w:name="Light Shading Accent 6"/>
-    <w:lsdException w:unhideWhenUsed="0" w:uiPriority="61" w:semiHidden="0" w:name="Light List Accent 6"/>
-    <w:lsdException w:unhideWhenUsed="0" w:uiPriority="62" w:semiHidden="0" w:name="Light Grid Accent 6"/>
-    <w:lsdException w:unhideWhenUsed="0" w:uiPriority="63" w:semiHidden="0" w:name="Medium Shading 1 Accent 6"/>
-    <w:lsdException w:unhideWhenUsed="0" w:uiPriority="64" w:semiHidden="0" w:name="Medium Shading 2 Accent 6"/>
-    <w:lsdException w:unhideWhenUsed="0" w:uiPriority="65" w:semiHidden="0" w:name="Medium List 1 Accent 6"/>
-    <w:lsdException w:unhideWhenUsed="0" w:uiPriority="66" w:semiHidden="0" w:name="Medium List 2 Accent 6"/>
-    <w:lsdException w:unhideWhenUsed="0" w:uiPriority="67" w:semiHidden="0" w:name="Medium Grid 1 Accent 6"/>
-    <w:lsdException w:unhideWhenUsed="0" w:uiPriority="68" w:semiHidden="0" w:name="Medium Grid 2 Accent 6"/>
-    <w:lsdException w:unhideWhenUsed="0" w:uiPriority="69" w:semiHidden="0" w:name="Medium Grid 3 Accent 6"/>
-    <w:lsdException w:unhideWhenUsed="0" w:uiPriority="70" w:semiHidden="0" w:name="Dark List Accent 6"/>
-    <w:lsdException w:unhideWhenUsed="0" w:uiPriority="71" w:semiHidden="0" w:name="Colorful Shading Accent 6"/>
-    <w:lsdException w:unhideWhenUsed="0" w:uiPriority="72" w:semiHidden="0" w:name="Colorful List Accent 6"/>
-    <w:lsdException w:unhideWhenUsed="0" w:uiPriority="73" w:semiHidden="0" w:name="Colorful Grid Accent 6"/>
+  <w:latentStyles w:defLockedState="0" w:defUIPriority="99" w:defSemiHidden="1" w:defUnhideWhenUsed="1" w:defQFormat="0" w:count="260">
+    <w:lsdException w:name="Colorful Shading Accent 4" w:uiPriority="71" w:semiHidden="0" w:unhideWhenUsed="0"/>
+    <w:lsdException w:name="Medium List 2 Accent 5" w:uiPriority="66" w:semiHidden="0" w:unhideWhenUsed="0"/>
+    <w:lsdException w:name="Light List Accent 2" w:uiPriority="61" w:semiHidden="0" w:unhideWhenUsed="0"/>
+    <w:lsdException w:name="heading 5" w:uiPriority="9" w:qFormat="1"/>
+    <w:lsdException w:name="Colorful Grid Accent 3" w:uiPriority="73" w:semiHidden="0" w:unhideWhenUsed="0"/>
+    <w:lsdException w:name="Colorful List Accent 2" w:uiPriority="72" w:semiHidden="0" w:unhideWhenUsed="0"/>
+    <w:lsdException w:name="Dark List Accent 6" w:uiPriority="70" w:semiHidden="0" w:unhideWhenUsed="0"/>
+    <w:lsdException w:name="Medium Shading 1 Accent 5" w:uiPriority="63" w:semiHidden="0" w:unhideWhenUsed="0"/>
+    <w:lsdException w:name="Emphasis" w:uiPriority="20" w:semiHidden="0" w:unhideWhenUsed="0" w:qFormat="1"/>
+    <w:lsdException w:name="Table Colorful 2" w:uiPriority="99"/>
+    <w:lsdException w:name="Colorful List Accent 1" w:uiPriority="72" w:semiHidden="0" w:unhideWhenUsed="0"/>
+    <w:lsdException w:name="Medium Shading 2 Accent 5" w:uiPriority="64" w:semiHidden="0" w:unhideWhenUsed="0"/>
+    <w:lsdException w:name="Table Colorful 1" w:uiPriority="99"/>
+    <w:lsdException w:name="Medium Grid 1 Accent 5" w:uiPriority="67" w:semiHidden="0" w:unhideWhenUsed="0"/>
+    <w:lsdException w:name="annotation subject" w:uiPriority="99"/>
+    <w:lsdException w:name="index heading" w:uiPriority="99"/>
+    <w:lsdException w:name="Colorful Shading Accent 6" w:uiPriority="71" w:semiHidden="0" w:unhideWhenUsed="0"/>
+    <w:lsdException w:name="Body Text First Indent 2" w:uiPriority="99"/>
+    <w:lsdException w:name="Table 3D effects 3" w:uiPriority="99"/>
+    <w:lsdException w:name="Closing" w:uiPriority="99"/>
+    <w:lsdException w:name="Light Grid Accent 6" w:uiPriority="62" w:semiHidden="0" w:unhideWhenUsed="0"/>
+    <w:lsdException w:name="Colorful Grid Accent 6" w:uiPriority="73" w:semiHidden="0" w:unhideWhenUsed="0"/>
+    <w:lsdException w:name="toc 2" w:uiPriority="39"/>
+    <w:lsdException w:name="HTML Cite" w:uiPriority="99"/>
+    <w:lsdException w:name="Dark List Accent 5" w:uiPriority="70" w:semiHidden="0" w:unhideWhenUsed="0"/>
+    <w:lsdException w:name="Medium List 1 Accent 6" w:uiPriority="65" w:semiHidden="0" w:unhideWhenUsed="0"/>
+    <w:lsdException w:name="Light List Accent 5" w:uiPriority="61" w:semiHidden="0" w:unhideWhenUsed="0"/>
+    <w:lsdException w:name="Medium Shading 1" w:uiPriority="63" w:semiHidden="0" w:unhideWhenUsed="0"/>
+    <w:lsdException w:name="Plain Text" w:uiPriority="99"/>
+    <w:lsdException w:name="Table Grid 5" w:uiPriority="99"/>
+    <w:lsdException w:name="List 4" w:uiPriority="99"/>
+    <w:lsdException w:name="Medium Grid 2 Accent 5" w:uiPriority="68" w:semiHidden="0" w:unhideWhenUsed="0"/>
+    <w:lsdException w:name="Medium Shading 2 Accent 2" w:uiPriority="64" w:semiHidden="0" w:unhideWhenUsed="0"/>
+    <w:lsdException w:name="Medium Grid 3 Accent 6" w:uiPriority="69" w:semiHidden="0" w:unhideWhenUsed="0"/>
+    <w:lsdException w:name="HTML Acronym" w:uiPriority="99"/>
+    <w:lsdException w:name="Table List 2" w:uiPriority="99"/>
+    <w:lsdException w:name="Medium Shading 2" w:uiPriority="64" w:semiHidden="0" w:unhideWhenUsed="0"/>
+    <w:lsdException w:name="Table Subtle 1" w:uiPriority="99"/>
+    <w:lsdException w:name="index 9" w:uiPriority="99"/>
+    <w:lsdException w:name="Medium Grid 1 Accent 3" w:uiPriority="67" w:semiHidden="0" w:unhideWhenUsed="0"/>
+    <w:lsdException w:name="List Bullet 3" w:uiPriority="99"/>
+    <w:lsdException w:name="HTML Typewriter" w:uiPriority="99"/>
+    <w:lsdException w:name="Table 3D effects 1" w:uiPriority="99"/>
+    <w:lsdException w:name="Table Simple 3" w:uiPriority="99"/>
+    <w:lsdException w:name="Medium Grid 1 Accent 2" w:uiPriority="67" w:semiHidden="0" w:unhideWhenUsed="0"/>
+    <w:lsdException w:name="List Paragraph" w:uiPriority="34" w:semiHidden="0" w:unhideWhenUsed="0" w:qFormat="1"/>
+    <w:lsdException w:name="Table Colorful 3" w:uiPriority="99"/>
+    <w:lsdException w:name="List Bullet 2" w:uiPriority="99"/>
+    <w:lsdException w:name="Light Shading" w:uiPriority="60" w:semiHidden="0" w:unhideWhenUsed="0"/>
+    <w:lsdException w:name="Table List 5" w:uiPriority="99"/>
+    <w:lsdException w:name="Medium Grid 2 Accent 6" w:uiPriority="68" w:semiHidden="0" w:unhideWhenUsed="0"/>
+    <w:lsdException w:name="Signature" w:uiPriority="99"/>
+    <w:lsdException w:name="Table Grid 3" w:uiPriority="99"/>
+    <w:lsdException w:name="Medium Grid 2 Accent 3" w:uiPriority="68" w:semiHidden="0" w:unhideWhenUsed="0"/>
+    <w:lsdException w:name="Light Grid Accent 1" w:uiPriority="62" w:semiHidden="0" w:unhideWhenUsed="0"/>
+    <w:lsdException w:name="index 5" w:uiPriority="99"/>
+    <w:lsdException w:name="Body Text Indent 3" w:uiPriority="99"/>
+    <w:lsdException w:name="List 3" w:uiPriority="99"/>
+    <w:lsdException w:name="Medium Grid 2" w:uiPriority="68" w:semiHidden="0" w:unhideWhenUsed="0"/>
+    <w:lsdException w:name="Table Web 1" w:uiPriority="99"/>
+    <w:lsdException w:name="Table Grid 8" w:uiPriority="99"/>
+    <w:lsdException w:name="List 2" w:uiPriority="99"/>
+    <w:lsdException w:name="Dark List Accent 4" w:uiPriority="70" w:semiHidden="0" w:unhideWhenUsed="0"/>
+    <w:lsdException w:name="Table Columns 5" w:uiPriority="99"/>
+    <w:lsdException w:name="List 5" w:uiPriority="99"/>
+    <w:lsdException w:name="Body Text Indent 2" w:uiPriority="99"/>
+    <w:lsdException w:name="line number" w:uiPriority="99"/>
+    <w:lsdException w:name="Medium Grid 3 Accent 5" w:uiPriority="69" w:semiHidden="0" w:unhideWhenUsed="0"/>
+    <w:lsdException w:name="Normal" w:uiPriority="0" w:semiHidden="0" w:unhideWhenUsed="0" w:qFormat="1"/>
+    <w:lsdException w:name="Colorful Shading" w:uiPriority="71" w:semiHidden="0" w:unhideWhenUsed="0"/>
+    <w:lsdException w:name="table of authorities" w:uiPriority="99"/>
+    <w:lsdException w:name="Table Columns 2" w:uiPriority="99"/>
+    <w:lsdException w:name="toc 7" w:uiPriority="39"/>
+    <w:lsdException w:name="List Continue 4" w:uiPriority="99"/>
+    <w:lsdException w:name="Table Columns 3" w:uiPriority="99"/>
+    <w:lsdException w:name="Medium List 1 Accent 3" w:uiPriority="65" w:semiHidden="0" w:unhideWhenUsed="0"/>
+    <w:lsdException w:name="FollowedHyperlink" w:uiPriority="99"/>
+    <w:lsdException w:name="Normal Table" w:uiPriority="99" w:qFormat="1"/>
+    <w:lsdException w:name="HTML Sample" w:uiPriority="99"/>
+    <w:lsdException w:name="Table List 7" w:uiPriority="99"/>
+    <w:lsdException w:name="Note Heading" w:uiPriority="99"/>
+    <w:lsdException w:name="HTML Variable" w:uiPriority="99"/>
+    <w:lsdException w:name="Medium Shading 1 Accent 2" w:uiPriority="63" w:semiHidden="0" w:unhideWhenUsed="0"/>
+    <w:lsdException w:name="Medium Grid 2 Accent 1" w:uiPriority="68" w:semiHidden="0" w:unhideWhenUsed="0"/>
+    <w:lsdException w:name="Salutation" w:uiPriority="99"/>
+    <w:lsdException w:name="table of figures" w:uiPriority="99"/>
+    <w:lsdException w:name="Colorful List Accent 4" w:uiPriority="72" w:semiHidden="0" w:unhideWhenUsed="0"/>
+    <w:lsdException w:name="Light Shading Accent 2" w:uiPriority="60" w:semiHidden="0" w:unhideWhenUsed="0"/>
+    <w:lsdException w:name="E-mail Signature" w:uiPriority="99"/>
+    <w:lsdException w:name="Table Classic 4" w:uiPriority="99"/>
+    <w:lsdException w:name="Dark List Accent 1" w:uiPriority="70" w:semiHidden="0" w:unhideWhenUsed="0"/>
+    <w:lsdException w:name="Light Shading Accent 1" w:uiPriority="60" w:semiHidden="0" w:unhideWhenUsed="0"/>
+    <w:lsdException w:name="macro" w:uiPriority="99"/>
+    <w:lsdException w:name="toc 5" w:uiPriority="39"/>
+    <w:lsdException w:name="Medium List 1 Accent 1" w:uiPriority="65" w:semiHidden="0" w:unhideWhenUsed="0"/>
+    <w:lsdException w:name="List Bullet" w:uiPriority="99"/>
+    <w:lsdException w:name="List Continue 2" w:uiPriority="99"/>
+    <w:lsdException w:name="Dark List Accent 2" w:uiPriority="70" w:semiHidden="0" w:unhideWhenUsed="0"/>
+    <w:lsdException w:name="Medium Shading 1 Accent 1" w:uiPriority="63" w:semiHidden="0" w:unhideWhenUsed="0"/>
+    <w:lsdException w:name="toc 4" w:uiPriority="39"/>
+    <w:lsdException w:name="heading 3" w:uiPriority="9" w:qFormat="1"/>
+    <w:lsdException w:name="List Continue 3" w:uiPriority="99"/>
+    <w:lsdException w:name="Medium List 2 Accent 2" w:uiPriority="66" w:semiHidden="0" w:unhideWhenUsed="0"/>
+    <w:lsdException w:name="HTML Definition" w:uiPriority="99"/>
+    <w:lsdException w:name="Medium Grid 2 Accent 4" w:uiPriority="68" w:semiHidden="0" w:unhideWhenUsed="0"/>
+    <w:lsdException w:name="Table Columns 4" w:uiPriority="99"/>
+    <w:lsdException w:name="Table Classic 3" w:uiPriority="99"/>
+    <w:lsdException w:name="Table Grid 1" w:uiPriority="99"/>
+    <w:lsdException w:name="page number" w:uiPriority="99"/>
+    <w:lsdException w:name="Strong" w:uiPriority="22" w:semiHidden="0" w:unhideWhenUsed="0" w:qFormat="1"/>
+    <w:lsdException w:name="List Continue" w:uiPriority="99"/>
+    <w:lsdException w:name="toc 8" w:uiPriority="39"/>
+    <w:lsdException w:name="Table Grid 4" w:uiPriority="99"/>
+    <w:lsdException w:name="Medium Grid 3 Accent 2" w:uiPriority="69" w:semiHidden="0" w:unhideWhenUsed="0"/>
+    <w:lsdException w:name="Colorful List Accent 3" w:uiPriority="72" w:semiHidden="0" w:unhideWhenUsed="0"/>
+    <w:lsdException w:name="Body Text 3" w:uiPriority="99"/>
+    <w:lsdException w:name="Normal (Web)" w:uiPriority="99"/>
+    <w:lsdException w:name="Subtitle" w:uiPriority="11" w:semiHidden="0" w:unhideWhenUsed="0" w:qFormat="1"/>
+    <w:lsdException w:name="Medium List 2" w:uiPriority="66" w:semiHidden="0" w:unhideWhenUsed="0"/>
+    <w:lsdException w:name="Table List 8" w:uiPriority="99"/>
+    <w:lsdException w:name="Colorful Grid Accent 5" w:uiPriority="73" w:semiHidden="0" w:unhideWhenUsed="0"/>
+    <w:lsdException w:name="header" w:uiPriority="99" w:semiHidden="0"/>
+    <w:lsdException w:name="Medium List 2 Accent 4" w:uiPriority="66" w:semiHidden="0" w:unhideWhenUsed="0"/>
+    <w:lsdException w:name="Table List 3" w:uiPriority="99"/>
+    <w:lsdException w:name="Medium List 2 Accent 1" w:uiPriority="66" w:semiHidden="0" w:unhideWhenUsed="0"/>
+    <w:lsdException w:name="HTML Code" w:uiPriority="99"/>
+    <w:lsdException w:name="Title" w:uiPriority="10" w:semiHidden="0" w:unhideWhenUsed="0" w:qFormat="1"/>
+    <w:lsdException w:name="Colorful Grid Accent 4" w:uiPriority="73" w:semiHidden="0" w:unhideWhenUsed="0"/>
+    <w:lsdException w:name="Light List Accent 6" w:uiPriority="61" w:semiHidden="0" w:unhideWhenUsed="0"/>
+    <w:lsdException w:name="footnote reference" w:uiPriority="99"/>
+    <w:lsdException w:name="Colorful List Accent 6" w:uiPriority="72" w:semiHidden="0" w:unhideWhenUsed="0"/>
+    <w:lsdException w:name="Table Grid 6" w:uiPriority="99"/>
+    <w:lsdException w:name="Colorful List Accent 5" w:uiPriority="72" w:semiHidden="0" w:unhideWhenUsed="0"/>
+    <w:lsdException w:name="Table Theme" w:uiPriority="99"/>
+    <w:lsdException w:name="Medium Shading 2 Accent 4" w:uiPriority="64" w:semiHidden="0" w:unhideWhenUsed="0"/>
+    <w:lsdException w:name="List Number 2" w:uiPriority="99"/>
+    <w:lsdException w:name="Medium Shading 1 Accent 6" w:uiPriority="63" w:semiHidden="0" w:unhideWhenUsed="0"/>
+    <w:lsdException w:name="List Number 3" w:uiPriority="99"/>
+    <w:lsdException w:name="Medium Grid 1 Accent 6" w:uiPriority="67" w:semiHidden="0" w:unhideWhenUsed="0"/>
+    <w:lsdException w:name="Medium Grid 2 Accent 2" w:uiPriority="68" w:semiHidden="0" w:unhideWhenUsed="0"/>
+    <w:lsdException w:name="Medium Grid 1" w:uiPriority="67" w:semiHidden="0" w:unhideWhenUsed="0"/>
+    <w:lsdException w:name="Colorful Shading Accent 2" w:uiPriority="71" w:semiHidden="0" w:unhideWhenUsed="0"/>
+    <w:lsdException w:name="List Bullet 5" w:uiPriority="99"/>
+    <w:lsdException w:name="Medium List 1" w:uiPriority="65" w:semiHidden="0" w:unhideWhenUsed="0"/>
+    <w:lsdException w:name="Light List Accent 1" w:uiPriority="61" w:semiHidden="0" w:unhideWhenUsed="0"/>
+    <w:lsdException w:name="Colorful Grid Accent 2" w:uiPriority="73" w:semiHidden="0" w:unhideWhenUsed="0"/>
+    <w:lsdException w:name="Table Grid 2" w:uiPriority="99"/>
+    <w:lsdException w:name="Medium Shading 1 Accent 4" w:uiPriority="63" w:semiHidden="0" w:unhideWhenUsed="0"/>
+    <w:lsdException w:name="Colorful Shading Accent 5" w:uiPriority="71" w:semiHidden="0" w:unhideWhenUsed="0"/>
+    <w:lsdException w:name="Light Shading Accent 4" w:uiPriority="60" w:semiHidden="0" w:unhideWhenUsed="0"/>
+    <w:lsdException w:name="Medium Grid 3 Accent 3" w:uiPriority="69" w:semiHidden="0" w:unhideWhenUsed="0"/>
+    <w:lsdException w:name="Colorful Grid Accent 1" w:uiPriority="73" w:semiHidden="0" w:unhideWhenUsed="0"/>
+    <w:lsdException w:name="index 7" w:uiPriority="99"/>
+    <w:lsdException w:name="Table Classic 2" w:uiPriority="99"/>
+    <w:lsdException w:name="Table Web 3" w:uiPriority="99"/>
+    <w:lsdException w:name="index 2" w:uiPriority="99"/>
+    <w:lsdException w:name="List Number 4" w:uiPriority="99"/>
+    <w:lsdException w:name="Medium Grid 3 Accent 4" w:uiPriority="69" w:semiHidden="0" w:unhideWhenUsed="0"/>
+    <w:lsdException w:name="Table Simple 1" w:uiPriority="99"/>
+    <w:lsdException w:name="footer" w:uiPriority="99" w:semiHidden="0"/>
+    <w:lsdException w:name="Table Web 2" w:uiPriority="99"/>
+    <w:lsdException w:name="Medium Shading 1 Accent 3" w:uiPriority="63" w:semiHidden="0" w:unhideWhenUsed="0"/>
+    <w:lsdException w:name="Body Text 2" w:uiPriority="99"/>
+    <w:lsdException w:name="heading 1" w:uiPriority="9" w:semiHidden="0" w:unhideWhenUsed="0" w:qFormat="1"/>
+    <w:lsdException w:name="Colorful Grid" w:uiPriority="73" w:semiHidden="0" w:unhideWhenUsed="0"/>
+    <w:lsdException w:name="caption" w:uiPriority="35" w:qFormat="1"/>
+    <w:lsdException w:name="heading 7" w:uiPriority="9" w:qFormat="1"/>
+    <w:lsdException w:name="Light List Accent 4" w:uiPriority="61" w:semiHidden="0" w:unhideWhenUsed="0"/>
+    <w:lsdException w:name="Light Grid Accent 4" w:uiPriority="62" w:semiHidden="0" w:unhideWhenUsed="0"/>
+    <w:lsdException w:name="heading 6" w:uiPriority="9" w:qFormat="1"/>
+    <w:lsdException w:name="Body Text" w:uiPriority="99"/>
+    <w:lsdException w:name="Table Grid 7" w:uiPriority="99"/>
+    <w:lsdException w:name="List" w:uiPriority="99"/>
+    <w:lsdException w:name="Medium Grid 3 Accent 1" w:uiPriority="69" w:semiHidden="0" w:unhideWhenUsed="0"/>
+    <w:lsdException w:name="Document Map" w:uiPriority="99"/>
+    <w:lsdException w:name="Table Classic 1" w:uiPriority="99"/>
+    <w:lsdException w:name="Table List 1" w:uiPriority="99"/>
+    <w:lsdException w:name="Date" w:uiPriority="99"/>
+    <w:lsdException w:name="Medium Shading 2 Accent 3" w:uiPriority="64" w:semiHidden="0" w:unhideWhenUsed="0"/>
+    <w:lsdException w:name="envelope address" w:uiPriority="99"/>
+    <w:lsdException w:name="Normal Indent" w:uiPriority="99"/>
+    <w:lsdException w:name="Table Subtle 2" w:uiPriority="99"/>
+    <w:lsdException w:name="index 8" w:uiPriority="99"/>
+    <w:lsdException w:name="Block Text" w:uiPriority="99"/>
+    <w:lsdException w:name="Table Columns 1" w:uiPriority="99"/>
+    <w:lsdException w:name="Light Shading Accent 3" w:uiPriority="60" w:semiHidden="0" w:unhideWhenUsed="0"/>
+    <w:lsdException w:name="List Number" w:uiPriority="99"/>
+    <w:lsdException w:name="Table Simple 2" w:uiPriority="99"/>
+    <w:lsdException w:name="heading 4" w:uiPriority="9" w:qFormat="1"/>
+    <w:lsdException w:name="Table 3D effects 2" w:uiPriority="99"/>
+    <w:lsdException w:name="Colorful Shading Accent 3" w:uiPriority="71" w:semiHidden="0" w:unhideWhenUsed="0"/>
+    <w:lsdException w:name="index 1" w:uiPriority="99"/>
+    <w:lsdException w:name="Table Contemporary" w:uiPriority="99"/>
+    <w:lsdException w:name="heading 9" w:uiPriority="9" w:qFormat="1"/>
+    <w:lsdException w:name="Table List 4" w:uiPriority="99"/>
+    <w:lsdException w:name="Medium Grid 3" w:uiPriority="69" w:semiHidden="0" w:unhideWhenUsed="0"/>
+    <w:lsdException w:name="Light List" w:uiPriority="61" w:semiHidden="0" w:unhideWhenUsed="0"/>
+    <w:lsdException w:name="List Continue 5" w:uiPriority="99"/>
+    <w:lsdException w:name="Dark List Accent 3" w:uiPriority="70" w:semiHidden="0" w:unhideWhenUsed="0"/>
+    <w:lsdException w:name="Body Text Indent" w:uiPriority="99"/>
+    <w:lsdException w:name="Light Shading Accent 6" w:uiPriority="60" w:semiHidden="0" w:unhideWhenUsed="0"/>
+    <w:lsdException w:name="Balloon Text" w:uiPriority="99"/>
+    <w:lsdException w:name="HTML Address" w:uiPriority="99"/>
+    <w:lsdException w:name="Medium Shading 2 Accent 6" w:uiPriority="64" w:semiHidden="0" w:unhideWhenUsed="0"/>
+    <w:lsdException w:name="Light Shading Accent 5" w:uiPriority="60" w:semiHidden="0" w:unhideWhenUsed="0"/>
+    <w:lsdException w:name="Medium Grid 1 Accent 4" w:uiPriority="67" w:semiHidden="0" w:unhideWhenUsed="0"/>
+    <w:lsdException w:name="index 4" w:uiPriority="99"/>
+    <w:lsdException w:name="toc 6" w:uiPriority="39"/>
+    <w:lsdException w:name="Medium Shading 2 Accent 1" w:uiPriority="64" w:semiHidden="0" w:unhideWhenUsed="0"/>
+    <w:lsdException w:name="Table Professional" w:uiPriority="99"/>
+    <w:lsdException w:name="Medium List 1 Accent 2" w:uiPriority="65" w:semiHidden="0" w:unhideWhenUsed="0"/>
+    <w:lsdException w:name="Dark List" w:uiPriority="70" w:semiHidden="0" w:unhideWhenUsed="0"/>
+    <w:lsdException w:name="toc 9" w:uiPriority="39"/>
+    <w:lsdException w:name="envelope return" w:uiPriority="99"/>
+    <w:lsdException w:name="annotation text" w:uiPriority="99"/>
+    <w:lsdException w:name="Light Grid Accent 5" w:uiPriority="62" w:semiHidden="0" w:unhideWhenUsed="0"/>
+    <w:lsdException w:name="Table List 6" w:uiPriority="99"/>
+    <w:lsdException w:name="HTML Keyboard" w:uiPriority="99"/>
+    <w:lsdException w:name="toc 1" w:uiPriority="39"/>
+    <w:lsdException w:name="Light Grid Accent 3" w:uiPriority="62" w:semiHidden="0" w:unhideWhenUsed="0"/>
+    <w:lsdException w:name="Light List Accent 3" w:uiPriority="61" w:semiHidden="0" w:unhideWhenUsed="0"/>
+    <w:lsdException w:name="Light Grid Accent 2" w:uiPriority="62" w:semiHidden="0" w:unhideWhenUsed="0"/>
+    <w:lsdException w:name="Medium List 2 Accent 6" w:uiPriority="66" w:semiHidden="0" w:unhideWhenUsed="0"/>
+    <w:lsdException w:name="Light Grid" w:uiPriority="62" w:semiHidden="0" w:unhideWhenUsed="0"/>
+    <w:lsdException w:name="Hyperlink" w:uiPriority="99"/>
+    <w:lsdException w:name="toa heading" w:uiPriority="99"/>
+    <w:lsdException w:name="List Bullet 4" w:uiPriority="99"/>
+    <w:lsdException w:name="heading 8" w:uiPriority="9" w:qFormat="1"/>
+    <w:lsdException w:name="Table Elegant" w:uiPriority="99"/>
+    <w:lsdException w:name="Table Grid" w:uiPriority="39" w:semiHidden="0" w:unhideWhenUsed="0"/>
+    <w:lsdException w:name="Medium List 1 Accent 5" w:uiPriority="65" w:semiHidden="0" w:unhideWhenUsed="0"/>
+    <w:lsdException w:name="endnote reference" w:uiPriority="99"/>
+    <w:lsdException w:name="Medium List 1 Accent 4" w:uiPriority="65" w:semiHidden="0" w:unhideWhenUsed="0"/>
+    <w:lsdException w:name="Body Text First Indent" w:uiPriority="99"/>
+    <w:lsdException w:name="HTML Preformatted" w:uiPriority="99"/>
+    <w:lsdException w:name="endnote text" w:uiPriority="99"/>
+    <w:lsdException w:name="index 6" w:uiPriority="99"/>
+    <w:lsdException w:name="Medium Grid 1 Accent 1" w:uiPriority="67" w:semiHidden="0" w:unhideWhenUsed="0"/>
+    <w:lsdException w:name="Message Header" w:uiPriority="99"/>
+    <w:lsdException w:name="heading 2" w:uiPriority="9" w:qFormat="1"/>
+    <w:lsdException w:name="toc 3" w:uiPriority="39"/>
+    <w:lsdException w:name="Colorful Shading Accent 1" w:uiPriority="71" w:semiHidden="0" w:unhideWhenUsed="0"/>
+    <w:lsdException w:name="annotation reference" w:uiPriority="99"/>
+    <w:lsdException w:name="Medium List 2 Accent 3" w:uiPriority="66" w:semiHidden="0" w:unhideWhenUsed="0"/>
+    <w:lsdException w:name="index 3" w:uiPriority="99"/>
+    <w:lsdException w:name="Default Paragraph Font" w:uiPriority="1" w:qFormat="1"/>
+    <w:lsdException w:name="List Number 5" w:uiPriority="99"/>
+    <w:lsdException w:name="Colorful List" w:uiPriority="72" w:semiHidden="0" w:unhideWhenUsed="0"/>
+    <w:lsdException w:name="footnote text" w:uiPriority="99"/>
   </w:latentStyles>
-  <w:style w:type="paragraph" w:default="1" w:styleId="1">
-    <w:name w:val="Normal"/>
-    <w:qFormat/>
-    <w:uiPriority w:val="0"/>
-    <w:pPr>
-      <w:widowControl w:val="0"/>
-      <w:spacing w:after="0" w:line="240" w:lineRule="auto"/>
-      <w:jc w:val="both"/>
-    </w:pPr>
-    <w:rPr>
-      <w:rFonts w:ascii="Times New Roman" w:hAnsi="Times New Roman" w:eastAsia="宋体" w:cs="Times New Roman"/>
-      <w:kern w:val="2"/>
-      <w:sz w:val="21"/>
-      <w:szCs w:val="24"/>
-      <w:lang w:val="en-US" w:eastAsia="zh-CN" w:bidi="ar-SA"/>
-      <w14:ligatures w14:val="none"/>
-    </w:rPr>
+  <w:style w:type="character" w:styleId="00000b" w:default="1">
+    <w:name w:val="Default Paragraph Font"/>
+    <w:uiPriority w:val="1"/>
+    <w:semiHidden w:val="1"/>
+    <w:unhideWhenUsed w:val="1"/>
+    <w:qFormat w:val="1"/>
   </w:style>
-  <w:style w:type="character" w:default="1" w:styleId="7">
-    <w:name w:val="Default Paragraph Font"/>
-    <w:semiHidden/>
-    <w:unhideWhenUsed/>
-    <w:qFormat/>
-    <w:uiPriority w:val="1"/>
-  </w:style>
-  <w:style w:type="table" w:default="1" w:styleId="6">
-    <w:name w:val="Normal Table"/>
-    <w:semiHidden/>
-    <w:unhideWhenUsed/>
-    <w:qFormat/>
+  <w:style w:type="paragraph" w:styleId="000013">
+    <w:name w:val="HTML Preformatted"/>
+    <w:basedOn w:val="00000a"/>
     <w:uiPriority w:val="99"/>
-    <w:tblPr>
-      <w:tblCellMar>
-        <w:top w:w="0" w:type="dxa"/>
-        <w:left w:w="108" w:type="dxa"/>
-        <w:bottom w:w="0" w:type="dxa"/>
-        <w:right w:w="108" w:type="dxa"/>
-      </w:tblCellMar>
-    </w:tblPr>
-  </w:style>
-  <w:style w:type="paragraph" w:styleId="2">
-    <w:name w:val="footer"/>
-    <w:basedOn w:val="1"/>
-    <w:link w:val="9"/>
-    <w:unhideWhenUsed/>
-    <w:uiPriority w:val="99"/>
-    <w:pPr>
-      <w:tabs>
-        <w:tab w:val="center" w:pos="4153"/>
-        <w:tab w:val="right" w:pos="8306"/>
-      </w:tabs>
-      <w:snapToGrid w:val="0"/>
-    </w:pPr>
-    <w:rPr>
-      <w:sz w:val="18"/>
-      <w:szCs w:val="18"/>
-    </w:rPr>
-  </w:style>
-  <w:style w:type="paragraph" w:styleId="3">
-    <w:name w:val="header"/>
-    <w:basedOn w:val="1"/>
-    <w:link w:val="8"/>
-    <w:unhideWhenUsed/>
-    <w:uiPriority w:val="99"/>
-    <w:pPr>
-      <w:tabs>
-        <w:tab w:val="center" w:pos="4153"/>
-        <w:tab w:val="right" w:pos="8306"/>
-      </w:tabs>
-      <w:snapToGrid w:val="0"/>
-      <w:jc w:val="center"/>
-    </w:pPr>
-    <w:rPr>
-      <w:sz w:val="18"/>
-      <w:szCs w:val="18"/>
-    </w:rPr>
-  </w:style>
-  <w:style w:type="paragraph" w:styleId="4">
-    <w:name w:val="Subtitle"/>
-    <w:basedOn w:val="1"/>
-    <w:next w:val="1"/>
-    <w:link w:val="12"/>
-    <w:qFormat/>
-    <w:uiPriority w:val="11"/>
-    <w:pPr>
-      <w:spacing w:before="240" w:after="60" w:line="312" w:lineRule="auto"/>
-      <w:jc w:val="center"/>
-      <w:outlineLvl w:val="1"/>
-    </w:pPr>
-    <w:rPr>
-      <w:rFonts w:asciiTheme="minorHAnsi" w:hAnsiTheme="minorHAnsi" w:eastAsiaTheme="minorEastAsia" w:cstheme="minorBidi"/>
-      <w:b/>
-      <w:bCs/>
-      <w:kern w:val="28"/>
-      <w:sz w:val="32"/>
-      <w:szCs w:val="32"/>
-    </w:rPr>
-  </w:style>
-  <w:style w:type="paragraph" w:styleId="5">
-    <w:name w:val="HTML Preformatted"/>
-    <w:basedOn w:val="1"/>
-    <w:semiHidden/>
-    <w:unhideWhenUsed/>
-    <w:uiPriority w:val="99"/>
+    <w:semiHidden w:val="1"/>
+    <w:unhideWhenUsed w:val="1"/>
     <w:pPr>
       <w:tabs>
         <w:tab w:val="left" w:pos="916"/>
@@ -3285,34 +2704,13 @@
       <w:lang w:val="en-US" w:eastAsia="zh-CN" w:bidi="ar"/>
     </w:rPr>
   </w:style>
-  <w:style w:type="character" w:customStyle="1" w:styleId="8">
-    <w:name w:val="页眉 字符"/>
-    <w:basedOn w:val="7"/>
-    <w:link w:val="3"/>
-    <w:uiPriority w:val="99"/>
-    <w:rPr>
-      <w:sz w:val="18"/>
-      <w:szCs w:val="18"/>
-    </w:rPr>
-  </w:style>
-  <w:style w:type="character" w:customStyle="1" w:styleId="9">
-    <w:name w:val="页脚 字符"/>
-    <w:basedOn w:val="7"/>
-    <w:link w:val="2"/>
-    <w:qFormat/>
-    <w:uiPriority w:val="99"/>
-    <w:rPr>
-      <w:sz w:val="18"/>
-      <w:szCs w:val="18"/>
-    </w:rPr>
-  </w:style>
-  <w:style w:type="paragraph" w:customStyle="1" w:styleId="10">
+  <w:style w:type="paragraph" w:styleId="000014" w:customStyle="1">
     <w:name w:val="xl22"/>
-    <w:basedOn w:val="1"/>
-    <w:qFormat/>
+    <w:basedOn w:val="00000a"/>
     <w:uiPriority w:val="0"/>
+    <w:qFormat w:val="1"/>
     <w:pPr>
-      <w:widowControl/>
+      <w:widowControl w:val="1"/>
       <w:spacing w:before="100" w:beforeAutospacing="1" w:after="100" w:afterAutospacing="1"/>
       <w:jc w:val="center"/>
     </w:pPr>
@@ -3322,28 +2720,140 @@
       <w:sz w:val="24"/>
     </w:rPr>
   </w:style>
-  <w:style w:type="paragraph" w:styleId="11">
+  <w:style w:type="character" w:styleId="00000e" w:customStyle="1">
+    <w:name w:val="页脚 字符"/>
+    <w:basedOn w:val="00000b"/>
+    <w:link w:val="00000d"/>
+    <w:uiPriority w:val="99"/>
+    <w:qFormat w:val="1"/>
+    <w:rPr>
+      <w:sz w:val="18"/>
+      <w:szCs w:val="18"/>
+    </w:rPr>
+  </w:style>
+  <w:style w:type="character" w:styleId="000012" w:customStyle="1">
+    <w:name w:val="副标题 字符"/>
+    <w:basedOn w:val="00000b"/>
+    <w:link w:val="000011"/>
+    <w:uiPriority w:val="11"/>
+    <w:qFormat w:val="1"/>
+    <w:rPr>
+      <w:b w:val="1"/>
+      <w:bCs w:val="1"/>
+      <w:kern w:val="28"/>
+      <w:sz w:val="32"/>
+      <w:szCs w:val="32"/>
+      <w14:ligatures w14:val="none"/>
+    </w:rPr>
+  </w:style>
+  <w:style w:type="paragraph" w:styleId="000015">
     <w:name w:val="List Paragraph"/>
-    <w:basedOn w:val="1"/>
-    <w:qFormat/>
+    <w:basedOn w:val="00000a"/>
     <w:uiPriority w:val="34"/>
+    <w:qFormat w:val="1"/>
     <w:pPr>
       <w:ind w:firstLine="420" w:firstLineChars="200"/>
     </w:pPr>
   </w:style>
-  <w:style w:type="character" w:customStyle="1" w:styleId="12">
-    <w:name w:val="副标题 字符"/>
-    <w:basedOn w:val="7"/>
-    <w:link w:val="4"/>
-    <w:qFormat/>
+  <w:style w:type="table" w:styleId="00000c" w:default="1">
+    <w:name w:val="Normal Table"/>
+    <w:uiPriority w:val="99"/>
+    <w:semiHidden w:val="1"/>
+    <w:unhideWhenUsed w:val="1"/>
+    <w:qFormat w:val="1"/>
+    <w:tblPr>
+      <w:tblCellMar>
+        <w:top w:w="0" w:type="dxa"/>
+        <w:left w:w="108" w:type="dxa"/>
+        <w:bottom w:w="0" w:type="dxa"/>
+        <w:right w:w="108" w:type="dxa"/>
+      </w:tblCellMar>
+    </w:tblPr>
+  </w:style>
+  <w:style w:type="paragraph" w:styleId="000011">
+    <w:name w:val="Subtitle"/>
+    <w:basedOn w:val="00000a"/>
+    <w:next w:val="00000a"/>
+    <w:link w:val="000012"/>
     <w:uiPriority w:val="11"/>
+    <w:qFormat w:val="1"/>
+    <w:pPr>
+      <w:spacing w:before="240" w:after="60" w:line="312" w:lineRule="auto"/>
+      <w:jc w:val="center"/>
+      <w:outlineLvl w:val="1"/>
+    </w:pPr>
     <w:rPr>
-      <w:b/>
-      <w:bCs/>
+      <w:rFonts w:asciiTheme="minorHAnsi" w:hAnsiTheme="minorHAnsi" w:eastAsiaTheme="minorEastAsia" w:cstheme="minorBidi"/>
+      <w:b w:val="1"/>
+      <w:bCs w:val="1"/>
       <w:kern w:val="28"/>
       <w:sz w:val="32"/>
       <w:szCs w:val="32"/>
+    </w:rPr>
+  </w:style>
+  <w:style w:type="paragraph" w:styleId="00000f">
+    <w:name w:val="header"/>
+    <w:basedOn w:val="00000a"/>
+    <w:link w:val="000010"/>
+    <w:uiPriority w:val="99"/>
+    <w:unhideWhenUsed w:val="1"/>
+    <w:pPr>
+      <w:tabs>
+        <w:tab w:val="center" w:pos="4153"/>
+        <w:tab w:val="right" w:pos="8306"/>
+      </w:tabs>
+      <w:snapToGrid w:val="0"/>
+      <w:jc w:val="center"/>
+    </w:pPr>
+    <w:rPr>
+      <w:sz w:val="18"/>
+      <w:szCs w:val="18"/>
+    </w:rPr>
+  </w:style>
+  <w:style w:type="paragraph" w:styleId="00000d">
+    <w:name w:val="footer"/>
+    <w:basedOn w:val="00000a"/>
+    <w:link w:val="00000e"/>
+    <w:uiPriority w:val="99"/>
+    <w:unhideWhenUsed w:val="1"/>
+    <w:pPr>
+      <w:tabs>
+        <w:tab w:val="center" w:pos="4153"/>
+        <w:tab w:val="right" w:pos="8306"/>
+      </w:tabs>
+      <w:snapToGrid w:val="0"/>
+    </w:pPr>
+    <w:rPr>
+      <w:sz w:val="18"/>
+      <w:szCs w:val="18"/>
+    </w:rPr>
+  </w:style>
+  <w:style w:type="paragraph" w:styleId="00000a" w:default="1">
+    <w:name w:val="Normal"/>
+    <w:uiPriority w:val="0"/>
+    <w:qFormat w:val="1"/>
+    <w:pPr>
+      <w:widowControl w:val="0"/>
+      <w:spacing w:after="0" w:line="240" w:lineRule="auto"/>
+      <w:jc w:val="both"/>
+    </w:pPr>
+    <w:rPr>
+      <w:rFonts w:ascii="Times New Roman" w:hAnsi="Times New Roman" w:eastAsia="宋体" w:cs="Times New Roman"/>
+      <w:kern w:val="2"/>
+      <w:sz w:val="21"/>
+      <w:szCs w:val="24"/>
+      <w:lang w:val="en-US" w:eastAsia="zh-CN" w:bidi="ar-SA"/>
       <w14:ligatures w14:val="none"/>
+    </w:rPr>
+  </w:style>
+  <w:style w:type="character" w:styleId="000010" w:customStyle="1">
+    <w:name w:val="页眉 字符"/>
+    <w:basedOn w:val="00000b"/>
+    <w:link w:val="00000f"/>
+    <w:uiPriority w:val="99"/>
+    <w:rPr>
+      <w:sz w:val="18"/>
+      <w:szCs w:val="18"/>
     </w:rPr>
   </w:style>
 </w:styles>

</xml_diff>